<commit_message>
Pack 33.6.1: правки шаблона employer_letter_template.docx
</commit_message>
<xml_diff>
--- a/templates/docx/contracts/by_company/buki_vedi/contract_template.docx
+++ b/templates/docx/contracts/by_company/buki_vedi/contract_template.docx
@@ -1,6 +1,6 @@
 
 <file path=word/document.xml><?xml version="1.0" encoding="utf-8"?>
-<w:document xmlns:wpc="http://schemas.microsoft.com/office/word/2010/wordprocessingCanvas" xmlns:cx="http://schemas.microsoft.com/office/drawing/2014/chartex" xmlns:cx1="http://schemas.microsoft.com/office/drawing/2015/9/8/chartex" xmlns:cx2="http://schemas.microsoft.com/office/drawing/2015/10/21/chartex" xmlns:cx3="http://schemas.microsoft.com/office/drawing/2016/5/9/chartex" xmlns:cx4="http://schemas.microsoft.com/office/drawing/2016/5/10/chartex" xmlns:cx5="http://schemas.microsoft.com/office/drawing/2016/5/11/chartex" xmlns:cx6="http://schemas.microsoft.com/office/drawing/2016/5/12/chartex" xmlns:cx7="http://schemas.microsoft.com/office/drawing/2016/5/13/chartex" xmlns:cx8="http://schemas.microsoft.com/office/drawing/2016/5/14/chartex" xmlns:mc="http://schemas.openxmlformats.org/markup-compatibility/2006" xmlns:aink="http://schemas.microsoft.com/office/drawing/2016/ink" xmlns:am3d="http://schemas.microsoft.com/office/drawing/2017/model3d" xmlns:o="urn:schemas-microsoft-com:office:office" xmlns:oel="http://schemas.microsoft.com/office/2019/extlst" xmlns:r="http://schemas.openxmlformats.org/officeDocument/2006/relationships" xmlns:m="http://schemas.openxmlformats.org/officeDocument/2006/math" xmlns:v="urn:schemas-microsoft-com:vml" xmlns:wp14="http://schemas.microsoft.com/office/word/2010/wordprocessingDrawing" xmlns:wp="http://schemas.openxmlformats.org/drawingml/2006/wordprocessingDrawing" xmlns:w10="urn:schemas-microsoft-com:office:word" xmlns:w="http://schemas.openxmlformats.org/wordprocessingml/2006/main" xmlns:w14="http://schemas.microsoft.com/office/word/2010/wordml" xmlns:w15="http://schemas.microsoft.com/office/word/2012/wordml" xmlns:w16cex="http://schemas.microsoft.com/office/word/2018/wordml/cex" xmlns:w16cid="http://schemas.microsoft.com/office/word/2016/wordml/cid" xmlns:w16="http://schemas.microsoft.com/office/word/2018/wordml" xmlns:w16du="http://schemas.microsoft.com/office/word/2023/wordml/word16du" xmlns:w16sdtdh="http://schemas.microsoft.com/office/word/2020/wordml/sdtdatahash" xmlns:w16sdtfl="http://schemas.microsoft.com/office/word/2024/wordml/sdtformatlock" xmlns:w16se="http://schemas.microsoft.com/office/word/2015/wordml/symex" xmlns:wpg="http://schemas.microsoft.com/office/word/2010/wordprocessingGroup" xmlns:wpi="http://schemas.microsoft.com/office/word/2010/wordprocessingInk" xmlns:wne="http://schemas.microsoft.com/office/word/2006/wordml" xmlns:wps="http://schemas.microsoft.com/office/word/2010/wordprocessingShape" mc:Ignorable="w14 w15 w16se w16cid w16 w16cex w16sdtdh w16sdtfl w16du wp14">
+<w:document xmlns:wpc="http://schemas.microsoft.com/office/word/2010/wordprocessingCanvas" xmlns:cx="http://schemas.microsoft.com/office/drawing/2014/chartex" xmlns:cx1="http://schemas.microsoft.com/office/drawing/2015/9/8/chartex" xmlns:cx2="http://schemas.microsoft.com/office/drawing/2015/10/21/chartex" xmlns:cx3="http://schemas.microsoft.com/office/drawing/2016/5/9/chartex" xmlns:cx4="http://schemas.microsoft.com/office/drawing/2016/5/10/chartex" xmlns:cx5="http://schemas.microsoft.com/office/drawing/2016/5/11/chartex" xmlns:cx6="http://schemas.microsoft.com/office/drawing/2016/5/12/chartex" xmlns:cx7="http://schemas.microsoft.com/office/drawing/2016/5/13/chartex" xmlns:cx8="http://schemas.microsoft.com/office/drawing/2016/5/14/chartex" xmlns:mc="http://schemas.openxmlformats.org/markup-compatibility/2006" xmlns:aink="http://schemas.microsoft.com/office/drawing/2016/ink" xmlns:am3d="http://schemas.microsoft.com/office/drawing/2017/model3d" xmlns:o="urn:schemas-microsoft-com:office:office" xmlns:r="http://schemas.openxmlformats.org/officeDocument/2006/relationships" xmlns:m="http://schemas.openxmlformats.org/officeDocument/2006/math" xmlns:v="urn:schemas-microsoft-com:vml" xmlns:wp14="http://schemas.microsoft.com/office/word/2010/wordprocessingDrawing" xmlns:wp="http://schemas.openxmlformats.org/drawingml/2006/wordprocessingDrawing" xmlns:w10="urn:schemas-microsoft-com:office:word" xmlns:w="http://schemas.openxmlformats.org/wordprocessingml/2006/main" xmlns:w14="http://schemas.microsoft.com/office/word/2010/wordml" xmlns:w15="http://schemas.microsoft.com/office/word/2012/wordml" xmlns:w16cid="http://schemas.microsoft.com/office/word/2016/wordml/cid" xmlns:w16se="http://schemas.microsoft.com/office/word/2015/wordml/symex" xmlns:wpg="http://schemas.microsoft.com/office/word/2010/wordprocessingGroup" xmlns:wpi="http://schemas.microsoft.com/office/word/2010/wordprocessingInk" xmlns:wne="http://schemas.microsoft.com/office/word/2006/wordml" xmlns:wps="http://schemas.microsoft.com/office/word/2010/wordprocessingShape" mc:Ignorable="w14 w15 w16se w16cid wp14">
   <w:body>
     <w:p>
       <w:pPr>
@@ -63,6 +63,7 @@
           <w:rFonts w:ascii="Cambria" w:hAnsi="Cambria" w:cs="Times New Roman;Times New Roman"/>
           <w:sz w:val="22"/>
           <w:szCs w:val="22"/>
+          <w:lang w:val="en-US"/>
         </w:rPr>
       </w:pPr>
       <w:r>
@@ -71,7 +72,76 @@
           <w:sz w:val="22"/>
           <w:szCs w:val="22"/>
         </w:rPr>
-        <w:t>г. {{ contract.sign_city }}                                                                                                                                                   {{ contract.sign_date_str }}</w:t>
+        <w:t>г</w:t>
+      </w:r>
+      <w:r>
+        <w:rPr>
+          <w:rFonts w:ascii="Cambria" w:hAnsi="Cambria" w:cs="Times New Roman;Times New Roman"/>
+          <w:sz w:val="22"/>
+          <w:szCs w:val="22"/>
+          <w:lang w:val="en-US"/>
+        </w:rPr>
+        <w:t xml:space="preserve">. </w:t>
+      </w:r>
+      <w:proofErr w:type="gramStart"/>
+      <w:r>
+        <w:rPr>
+          <w:rFonts w:ascii="Cambria" w:hAnsi="Cambria" w:cs="Times New Roman;Times New Roman"/>
+          <w:sz w:val="22"/>
+          <w:szCs w:val="22"/>
+          <w:lang w:val="en-US"/>
+        </w:rPr>
+        <w:t xml:space="preserve">{{ </w:t>
+      </w:r>
+      <w:proofErr w:type="spellStart"/>
+      <w:r>
+        <w:rPr>
+          <w:rFonts w:ascii="Cambria" w:hAnsi="Cambria" w:cs="Times New Roman;Times New Roman"/>
+          <w:sz w:val="22"/>
+          <w:szCs w:val="22"/>
+          <w:lang w:val="en-US"/>
+        </w:rPr>
+        <w:t>contract</w:t>
+      </w:r>
+      <w:proofErr w:type="gramEnd"/>
+      <w:r>
+        <w:rPr>
+          <w:rFonts w:ascii="Cambria" w:hAnsi="Cambria" w:cs="Times New Roman;Times New Roman"/>
+          <w:sz w:val="22"/>
+          <w:szCs w:val="22"/>
+          <w:lang w:val="en-US"/>
+        </w:rPr>
+        <w:t>.sign_city</w:t>
+      </w:r>
+      <w:proofErr w:type="spellEnd"/>
+      <w:r>
+        <w:rPr>
+          <w:rFonts w:ascii="Cambria" w:hAnsi="Cambria" w:cs="Times New Roman;Times New Roman"/>
+          <w:sz w:val="22"/>
+          <w:szCs w:val="22"/>
+          <w:lang w:val="en-US"/>
+        </w:rPr>
+        <w:t xml:space="preserve"> }}                                                                                                                                                   {{ </w:t>
+      </w:r>
+      <w:proofErr w:type="spellStart"/>
+      <w:r>
+        <w:rPr>
+          <w:rFonts w:ascii="Cambria" w:hAnsi="Cambria" w:cs="Times New Roman;Times New Roman"/>
+          <w:sz w:val="22"/>
+          <w:szCs w:val="22"/>
+          <w:lang w:val="en-US"/>
+        </w:rPr>
+        <w:t>contract.sign_date_str</w:t>
+      </w:r>
+      <w:proofErr w:type="spellEnd"/>
+      <w:r>
+        <w:rPr>
+          <w:rFonts w:ascii="Cambria" w:hAnsi="Cambria" w:cs="Times New Roman;Times New Roman"/>
+          <w:sz w:val="22"/>
+          <w:szCs w:val="22"/>
+          <w:lang w:val="en-US"/>
+        </w:rPr>
+        <w:t xml:space="preserve"> }}</w:t>
       </w:r>
     </w:p>
     <w:p>
@@ -81,6 +151,7 @@
           <w:rFonts w:ascii="Cambria" w:hAnsi="Cambria"/>
           <w:sz w:val="22"/>
           <w:szCs w:val="22"/>
+          <w:lang w:val="en-US"/>
         </w:rPr>
       </w:pPr>
     </w:p>
@@ -92,6 +163,7 @@
           <w:rFonts w:ascii="Cambria" w:hAnsi="Cambria" w:cs="Times New Roman;Times New Roman"/>
           <w:sz w:val="22"/>
           <w:szCs w:val="22"/>
+          <w:lang w:val="en-US"/>
         </w:rPr>
       </w:pPr>
       <w:r>
@@ -99,25 +171,754 @@
           <w:rFonts w:ascii="Cambria" w:hAnsi="Cambria" w:cs="Times New Roman;Times New Roman"/>
           <w:sz w:val="22"/>
           <w:szCs w:val="22"/>
-        </w:rPr>
-        <w:t xml:space="preserve">{{ applicant.citizen_phrase }} {{ applicant.full_name_native }}, именуем{{ applicant.named_suffix }} в дальнейшем "Исполнитель", паспорт  </w:t>
-      </w:r>
-      <w:r>
-        <w:rPr>
-          <w:rFonts w:ascii="Cambria" w:hAnsi="Cambria" w:cs="Times New Roman;Times New Roman"/>
-          <w:sz w:val="22"/>
-          <w:szCs w:val="22"/>
           <w:lang w:val="en-US"/>
         </w:rPr>
-        <w:t xml:space="preserve">{{ applicant.passport_formatted }}</w:t>
-      </w:r>
-      <w:r>
-        <w:rPr>
-          <w:rFonts w:ascii="Cambria" w:hAnsi="Cambria" w:cs="Times New Roman;Times New Roman"/>
-          <w:sz w:val="22"/>
-          <w:szCs w:val="22"/>
-        </w:rPr>
-        <w:t xml:space="preserve">,  выдан {{ applicant.passport_issuer }}  {{ fmt_date_ru(applicant.passport_issue_date) }}г., с  одной стороны  и {{ company.full_name_ru }}, именуемое в дальнейшем  "Заказчик", в лице {{ company.director_position_ru }} {{ company.director_full_name_genitive_ru }}, с другой стороны, совместно именуемые "Стороны", по отдельности "Сторона", заключили настоящий Договор о нижеследующем:</w:t>
+        <w:t xml:space="preserve">{{ </w:t>
+      </w:r>
+      <w:proofErr w:type="spellStart"/>
+      <w:r>
+        <w:rPr>
+          <w:rFonts w:ascii="Cambria" w:hAnsi="Cambria" w:cs="Times New Roman;Times New Roman"/>
+          <w:sz w:val="22"/>
+          <w:szCs w:val="22"/>
+          <w:lang w:val="en-US"/>
+        </w:rPr>
+        <w:t>applicant.citizen_phrase</w:t>
+      </w:r>
+      <w:proofErr w:type="spellEnd"/>
+      <w:r>
+        <w:rPr>
+          <w:rFonts w:ascii="Cambria" w:hAnsi="Cambria" w:cs="Times New Roman;Times New Roman"/>
+          <w:sz w:val="22"/>
+          <w:szCs w:val="22"/>
+          <w:lang w:val="en-US"/>
+        </w:rPr>
+        <w:t xml:space="preserve"> }} {{ </w:t>
+      </w:r>
+      <w:proofErr w:type="spellStart"/>
+      <w:r>
+        <w:rPr>
+          <w:rFonts w:ascii="Cambria" w:hAnsi="Cambria" w:cs="Times New Roman;Times New Roman"/>
+          <w:sz w:val="22"/>
+          <w:szCs w:val="22"/>
+          <w:lang w:val="en-US"/>
+        </w:rPr>
+        <w:t>applicant.full_name_native</w:t>
+      </w:r>
+      <w:proofErr w:type="spellEnd"/>
+      <w:r>
+        <w:rPr>
+          <w:rFonts w:ascii="Cambria" w:hAnsi="Cambria" w:cs="Times New Roman;Times New Roman"/>
+          <w:sz w:val="22"/>
+          <w:szCs w:val="22"/>
+          <w:lang w:val="en-US"/>
+        </w:rPr>
+        <w:t xml:space="preserve"> }}, </w:t>
+      </w:r>
+      <w:r>
+        <w:rPr>
+          <w:rFonts w:ascii="Cambria" w:hAnsi="Cambria" w:cs="Times New Roman;Times New Roman"/>
+          <w:sz w:val="22"/>
+          <w:szCs w:val="22"/>
+        </w:rPr>
+        <w:t>именуем</w:t>
+      </w:r>
+      <w:r>
+        <w:rPr>
+          <w:rFonts w:ascii="Cambria" w:hAnsi="Cambria" w:cs="Times New Roman;Times New Roman"/>
+          <w:sz w:val="22"/>
+          <w:szCs w:val="22"/>
+          <w:lang w:val="en-US"/>
+        </w:rPr>
+        <w:t xml:space="preserve">{{ </w:t>
+      </w:r>
+      <w:proofErr w:type="spellStart"/>
+      <w:r>
+        <w:rPr>
+          <w:rFonts w:ascii="Cambria" w:hAnsi="Cambria" w:cs="Times New Roman;Times New Roman"/>
+          <w:sz w:val="22"/>
+          <w:szCs w:val="22"/>
+          <w:lang w:val="en-US"/>
+        </w:rPr>
+        <w:t>applicant.named_suffix</w:t>
+      </w:r>
+      <w:proofErr w:type="spellEnd"/>
+      <w:r>
+        <w:rPr>
+          <w:rFonts w:ascii="Cambria" w:hAnsi="Cambria" w:cs="Times New Roman;Times New Roman"/>
+          <w:sz w:val="22"/>
+          <w:szCs w:val="22"/>
+          <w:lang w:val="en-US"/>
+        </w:rPr>
+        <w:t xml:space="preserve"> }} </w:t>
+      </w:r>
+      <w:r>
+        <w:rPr>
+          <w:rFonts w:ascii="Cambria" w:hAnsi="Cambria" w:cs="Times New Roman;Times New Roman"/>
+          <w:sz w:val="22"/>
+          <w:szCs w:val="22"/>
+        </w:rPr>
+        <w:t>в</w:t>
+      </w:r>
+      <w:r>
+        <w:rPr>
+          <w:rFonts w:ascii="Cambria" w:hAnsi="Cambria" w:cs="Times New Roman;Times New Roman"/>
+          <w:sz w:val="22"/>
+          <w:szCs w:val="22"/>
+          <w:lang w:val="en-US"/>
+        </w:rPr>
+        <w:t xml:space="preserve"> </w:t>
+      </w:r>
+      <w:r>
+        <w:rPr>
+          <w:rFonts w:ascii="Cambria" w:hAnsi="Cambria" w:cs="Times New Roman;Times New Roman"/>
+          <w:sz w:val="22"/>
+          <w:szCs w:val="22"/>
+        </w:rPr>
+        <w:t>дальнейшем</w:t>
+      </w:r>
+      <w:r>
+        <w:rPr>
+          <w:rFonts w:ascii="Cambria" w:hAnsi="Cambria" w:cs="Times New Roman;Times New Roman"/>
+          <w:sz w:val="22"/>
+          <w:szCs w:val="22"/>
+          <w:lang w:val="en-US"/>
+        </w:rPr>
+        <w:t xml:space="preserve"> "</w:t>
+      </w:r>
+      <w:r>
+        <w:rPr>
+          <w:rFonts w:ascii="Cambria" w:hAnsi="Cambria" w:cs="Times New Roman;Times New Roman"/>
+          <w:sz w:val="22"/>
+          <w:szCs w:val="22"/>
+        </w:rPr>
+        <w:t>Исполнитель</w:t>
+      </w:r>
+      <w:r>
+        <w:rPr>
+          <w:rFonts w:ascii="Cambria" w:hAnsi="Cambria" w:cs="Times New Roman;Times New Roman"/>
+          <w:sz w:val="22"/>
+          <w:szCs w:val="22"/>
+          <w:lang w:val="en-US"/>
+        </w:rPr>
+        <w:t xml:space="preserve">", </w:t>
+      </w:r>
+      <w:r>
+        <w:rPr>
+          <w:rFonts w:ascii="Cambria" w:hAnsi="Cambria" w:cs="Times New Roman;Times New Roman"/>
+          <w:sz w:val="22"/>
+          <w:szCs w:val="22"/>
+        </w:rPr>
+        <w:t>паспорт</w:t>
+      </w:r>
+      <w:r>
+        <w:rPr>
+          <w:rFonts w:ascii="Cambria" w:hAnsi="Cambria" w:cs="Times New Roman;Times New Roman"/>
+          <w:sz w:val="22"/>
+          <w:szCs w:val="22"/>
+          <w:lang w:val="en-US"/>
+        </w:rPr>
+        <w:t xml:space="preserve">  </w:t>
+      </w:r>
+      <w:r>
+        <w:rPr>
+          <w:rFonts w:ascii="Cambria" w:hAnsi="Cambria" w:cs="Times New Roman;Times New Roman"/>
+          <w:sz w:val="22"/>
+          <w:szCs w:val="22"/>
+          <w:lang w:val="en-US"/>
+        </w:rPr>
+        <w:t xml:space="preserve">{{ </w:t>
+      </w:r>
+      <w:proofErr w:type="spellStart"/>
+      <w:r>
+        <w:rPr>
+          <w:rFonts w:ascii="Cambria" w:hAnsi="Cambria" w:cs="Times New Roman;Times New Roman"/>
+          <w:sz w:val="22"/>
+          <w:szCs w:val="22"/>
+          <w:lang w:val="en-US"/>
+        </w:rPr>
+        <w:t>applicant.passport_formatted</w:t>
+      </w:r>
+      <w:proofErr w:type="spellEnd"/>
+      <w:r>
+        <w:rPr>
+          <w:rFonts w:ascii="Cambria" w:hAnsi="Cambria" w:cs="Times New Roman;Times New Roman"/>
+          <w:sz w:val="22"/>
+          <w:szCs w:val="22"/>
+          <w:lang w:val="en-US"/>
+        </w:rPr>
+        <w:t xml:space="preserve"> }}</w:t>
+      </w:r>
+      <w:r>
+        <w:rPr>
+          <w:rFonts w:ascii="Cambria" w:hAnsi="Cambria" w:cs="Times New Roman;Times New Roman"/>
+          <w:sz w:val="22"/>
+          <w:szCs w:val="22"/>
+          <w:lang w:val="en-US"/>
+        </w:rPr>
+        <w:t xml:space="preserve">,  </w:t>
+      </w:r>
+      <w:r>
+        <w:rPr>
+          <w:rFonts w:ascii="Cambria" w:hAnsi="Cambria" w:cs="Times New Roman;Times New Roman"/>
+          <w:sz w:val="22"/>
+          <w:szCs w:val="22"/>
+        </w:rPr>
+        <w:t>выдан</w:t>
+      </w:r>
+      <w:r>
+        <w:rPr>
+          <w:rFonts w:ascii="Cambria" w:hAnsi="Cambria" w:cs="Times New Roman;Times New Roman"/>
+          <w:sz w:val="22"/>
+          <w:szCs w:val="22"/>
+          <w:lang w:val="en-US"/>
+        </w:rPr>
+        <w:t xml:space="preserve"> {{ </w:t>
+      </w:r>
+      <w:proofErr w:type="spellStart"/>
+      <w:r>
+        <w:rPr>
+          <w:rFonts w:ascii="Cambria" w:hAnsi="Cambria" w:cs="Times New Roman;Times New Roman"/>
+          <w:sz w:val="22"/>
+          <w:szCs w:val="22"/>
+          <w:lang w:val="en-US"/>
+        </w:rPr>
+        <w:t>applicant.passport_issuer</w:t>
+      </w:r>
+      <w:proofErr w:type="spellEnd"/>
+      <w:r>
+        <w:rPr>
+          <w:rFonts w:ascii="Cambria" w:hAnsi="Cambria" w:cs="Times New Roman;Times New Roman"/>
+          <w:sz w:val="22"/>
+          <w:szCs w:val="22"/>
+          <w:lang w:val="en-US"/>
+        </w:rPr>
+        <w:t xml:space="preserve"> }}  {{ </w:t>
+      </w:r>
+      <w:proofErr w:type="spellStart"/>
+      <w:r>
+        <w:rPr>
+          <w:rFonts w:ascii="Cambria" w:hAnsi="Cambria" w:cs="Times New Roman;Times New Roman"/>
+          <w:sz w:val="22"/>
+          <w:szCs w:val="22"/>
+          <w:lang w:val="en-US"/>
+        </w:rPr>
+        <w:t>fmt_date_ru</w:t>
+      </w:r>
+      <w:proofErr w:type="spellEnd"/>
+      <w:r>
+        <w:rPr>
+          <w:rFonts w:ascii="Cambria" w:hAnsi="Cambria" w:cs="Times New Roman;Times New Roman"/>
+          <w:sz w:val="22"/>
+          <w:szCs w:val="22"/>
+          <w:lang w:val="en-US"/>
+        </w:rPr>
+        <w:t>(</w:t>
+      </w:r>
+      <w:proofErr w:type="spellStart"/>
+      <w:r>
+        <w:rPr>
+          <w:rFonts w:ascii="Cambria" w:hAnsi="Cambria" w:cs="Times New Roman;Times New Roman"/>
+          <w:sz w:val="22"/>
+          <w:szCs w:val="22"/>
+          <w:lang w:val="en-US"/>
+        </w:rPr>
+        <w:t>applicant.passport_issue_date</w:t>
+      </w:r>
+      <w:proofErr w:type="spellEnd"/>
+      <w:r>
+        <w:rPr>
+          <w:rFonts w:ascii="Cambria" w:hAnsi="Cambria" w:cs="Times New Roman;Times New Roman"/>
+          <w:sz w:val="22"/>
+          <w:szCs w:val="22"/>
+          <w:lang w:val="en-US"/>
+        </w:rPr>
+        <w:t>) }}</w:t>
+      </w:r>
+      <w:r>
+        <w:rPr>
+          <w:rFonts w:ascii="Cambria" w:hAnsi="Cambria" w:cs="Times New Roman;Times New Roman"/>
+          <w:sz w:val="22"/>
+          <w:szCs w:val="22"/>
+        </w:rPr>
+        <w:t>г</w:t>
+      </w:r>
+      <w:r>
+        <w:rPr>
+          <w:rFonts w:ascii="Cambria" w:hAnsi="Cambria" w:cs="Times New Roman;Times New Roman"/>
+          <w:sz w:val="22"/>
+          <w:szCs w:val="22"/>
+          <w:lang w:val="en-US"/>
+        </w:rPr>
+        <w:t xml:space="preserve">., </w:t>
+      </w:r>
+      <w:r>
+        <w:rPr>
+          <w:rFonts w:ascii="Cambria" w:hAnsi="Cambria" w:cs="Times New Roman;Times New Roman"/>
+          <w:sz w:val="22"/>
+          <w:szCs w:val="22"/>
+        </w:rPr>
+        <w:t>с</w:t>
+      </w:r>
+      <w:r>
+        <w:rPr>
+          <w:rFonts w:ascii="Cambria" w:hAnsi="Cambria" w:cs="Times New Roman;Times New Roman"/>
+          <w:sz w:val="22"/>
+          <w:szCs w:val="22"/>
+          <w:lang w:val="en-US"/>
+        </w:rPr>
+        <w:t xml:space="preserve">  </w:t>
+      </w:r>
+      <w:r>
+        <w:rPr>
+          <w:rFonts w:ascii="Cambria" w:hAnsi="Cambria" w:cs="Times New Roman;Times New Roman"/>
+          <w:sz w:val="22"/>
+          <w:szCs w:val="22"/>
+        </w:rPr>
+        <w:t>одной</w:t>
+      </w:r>
+      <w:r>
+        <w:rPr>
+          <w:rFonts w:ascii="Cambria" w:hAnsi="Cambria" w:cs="Times New Roman;Times New Roman"/>
+          <w:sz w:val="22"/>
+          <w:szCs w:val="22"/>
+          <w:lang w:val="en-US"/>
+        </w:rPr>
+        <w:t xml:space="preserve"> </w:t>
+      </w:r>
+      <w:r>
+        <w:rPr>
+          <w:rFonts w:ascii="Cambria" w:hAnsi="Cambria" w:cs="Times New Roman;Times New Roman"/>
+          <w:sz w:val="22"/>
+          <w:szCs w:val="22"/>
+        </w:rPr>
+        <w:t>стороны</w:t>
+      </w:r>
+      <w:r>
+        <w:rPr>
+          <w:rFonts w:ascii="Cambria" w:hAnsi="Cambria" w:cs="Times New Roman;Times New Roman"/>
+          <w:sz w:val="22"/>
+          <w:szCs w:val="22"/>
+          <w:lang w:val="en-US"/>
+        </w:rPr>
+        <w:t xml:space="preserve">  </w:t>
+      </w:r>
+      <w:r>
+        <w:rPr>
+          <w:rFonts w:ascii="Cambria" w:hAnsi="Cambria" w:cs="Times New Roman;Times New Roman"/>
+          <w:sz w:val="22"/>
+          <w:szCs w:val="22"/>
+        </w:rPr>
+        <w:t>и</w:t>
+      </w:r>
+      <w:r>
+        <w:rPr>
+          <w:rFonts w:ascii="Cambria" w:hAnsi="Cambria" w:cs="Times New Roman;Times New Roman"/>
+          <w:sz w:val="22"/>
+          <w:szCs w:val="22"/>
+          <w:lang w:val="en-US"/>
+        </w:rPr>
+        <w:t xml:space="preserve"> {{ </w:t>
+      </w:r>
+      <w:proofErr w:type="spellStart"/>
+      <w:r>
+        <w:rPr>
+          <w:rFonts w:ascii="Cambria" w:hAnsi="Cambria" w:cs="Times New Roman;Times New Roman"/>
+          <w:sz w:val="22"/>
+          <w:szCs w:val="22"/>
+          <w:lang w:val="en-US"/>
+        </w:rPr>
+        <w:t>company.full_name_ru</w:t>
+      </w:r>
+      <w:proofErr w:type="spellEnd"/>
+      <w:r>
+        <w:rPr>
+          <w:rFonts w:ascii="Cambria" w:hAnsi="Cambria" w:cs="Times New Roman;Times New Roman"/>
+          <w:sz w:val="22"/>
+          <w:szCs w:val="22"/>
+          <w:lang w:val="en-US"/>
+        </w:rPr>
+        <w:t xml:space="preserve"> }}, </w:t>
+      </w:r>
+      <w:r>
+        <w:rPr>
+          <w:rFonts w:ascii="Cambria" w:hAnsi="Cambria" w:cs="Times New Roman;Times New Roman"/>
+          <w:sz w:val="22"/>
+          <w:szCs w:val="22"/>
+        </w:rPr>
+        <w:t>именуемое</w:t>
+      </w:r>
+      <w:r>
+        <w:rPr>
+          <w:rFonts w:ascii="Cambria" w:hAnsi="Cambria" w:cs="Times New Roman;Times New Roman"/>
+          <w:sz w:val="22"/>
+          <w:szCs w:val="22"/>
+          <w:lang w:val="en-US"/>
+        </w:rPr>
+        <w:t xml:space="preserve"> </w:t>
+      </w:r>
+      <w:r>
+        <w:rPr>
+          <w:rFonts w:ascii="Cambria" w:hAnsi="Cambria" w:cs="Times New Roman;Times New Roman"/>
+          <w:sz w:val="22"/>
+          <w:szCs w:val="22"/>
+        </w:rPr>
+        <w:t>в</w:t>
+      </w:r>
+      <w:r>
+        <w:rPr>
+          <w:rFonts w:ascii="Cambria" w:hAnsi="Cambria" w:cs="Times New Roman;Times New Roman"/>
+          <w:sz w:val="22"/>
+          <w:szCs w:val="22"/>
+          <w:lang w:val="en-US"/>
+        </w:rPr>
+        <w:t xml:space="preserve"> </w:t>
+      </w:r>
+      <w:r>
+        <w:rPr>
+          <w:rFonts w:ascii="Cambria" w:hAnsi="Cambria" w:cs="Times New Roman;Times New Roman"/>
+          <w:sz w:val="22"/>
+          <w:szCs w:val="22"/>
+        </w:rPr>
+        <w:t>дальнейшем</w:t>
+      </w:r>
+      <w:r>
+        <w:rPr>
+          <w:rFonts w:ascii="Cambria" w:hAnsi="Cambria" w:cs="Times New Roman;Times New Roman"/>
+          <w:sz w:val="22"/>
+          <w:szCs w:val="22"/>
+          <w:lang w:val="en-US"/>
+        </w:rPr>
+        <w:t xml:space="preserve">  "</w:t>
+      </w:r>
+      <w:r>
+        <w:rPr>
+          <w:rFonts w:ascii="Cambria" w:hAnsi="Cambria" w:cs="Times New Roman;Times New Roman"/>
+          <w:sz w:val="22"/>
+          <w:szCs w:val="22"/>
+        </w:rPr>
+        <w:t>Заказчик</w:t>
+      </w:r>
+      <w:r>
+        <w:rPr>
+          <w:rFonts w:ascii="Cambria" w:hAnsi="Cambria" w:cs="Times New Roman;Times New Roman"/>
+          <w:sz w:val="22"/>
+          <w:szCs w:val="22"/>
+          <w:lang w:val="en-US"/>
+        </w:rPr>
+        <w:t xml:space="preserve">", </w:t>
+      </w:r>
+      <w:r>
+        <w:rPr>
+          <w:rFonts w:ascii="Cambria" w:hAnsi="Cambria" w:cs="Times New Roman;Times New Roman"/>
+          <w:sz w:val="22"/>
+          <w:szCs w:val="22"/>
+        </w:rPr>
+        <w:t>в</w:t>
+      </w:r>
+      <w:r>
+        <w:rPr>
+          <w:rFonts w:ascii="Cambria" w:hAnsi="Cambria" w:cs="Times New Roman;Times New Roman"/>
+          <w:sz w:val="22"/>
+          <w:szCs w:val="22"/>
+          <w:lang w:val="en-US"/>
+        </w:rPr>
+        <w:t xml:space="preserve"> </w:t>
+      </w:r>
+      <w:r>
+        <w:rPr>
+          <w:rFonts w:ascii="Cambria" w:hAnsi="Cambria" w:cs="Times New Roman;Times New Roman"/>
+          <w:sz w:val="22"/>
+          <w:szCs w:val="22"/>
+        </w:rPr>
+        <w:t>лице</w:t>
+      </w:r>
+      <w:r>
+        <w:rPr>
+          <w:rFonts w:ascii="Cambria" w:hAnsi="Cambria" w:cs="Times New Roman;Times New Roman"/>
+          <w:sz w:val="22"/>
+          <w:szCs w:val="22"/>
+          <w:lang w:val="en-US"/>
+        </w:rPr>
+        <w:t xml:space="preserve"> {{ </w:t>
+      </w:r>
+      <w:proofErr w:type="spellStart"/>
+      <w:r>
+        <w:rPr>
+          <w:rFonts w:ascii="Cambria" w:hAnsi="Cambria" w:cs="Times New Roman;Times New Roman"/>
+          <w:sz w:val="22"/>
+          <w:szCs w:val="22"/>
+          <w:lang w:val="en-US"/>
+        </w:rPr>
+        <w:t>company.director_position_ru</w:t>
+      </w:r>
+      <w:proofErr w:type="spellEnd"/>
+      <w:r>
+        <w:rPr>
+          <w:rFonts w:ascii="Cambria" w:hAnsi="Cambria" w:cs="Times New Roman;Times New Roman"/>
+          <w:sz w:val="22"/>
+          <w:szCs w:val="22"/>
+          <w:lang w:val="en-US"/>
+        </w:rPr>
+        <w:t xml:space="preserve"> }} {{ </w:t>
+      </w:r>
+      <w:proofErr w:type="spellStart"/>
+      <w:r>
+        <w:rPr>
+          <w:rFonts w:ascii="Cambria" w:hAnsi="Cambria" w:cs="Times New Roman;Times New Roman"/>
+          <w:sz w:val="22"/>
+          <w:szCs w:val="22"/>
+          <w:lang w:val="en-US"/>
+        </w:rPr>
+        <w:t>company.director_full_name_genitive_ru</w:t>
+      </w:r>
+      <w:proofErr w:type="spellEnd"/>
+      <w:r>
+        <w:rPr>
+          <w:rFonts w:ascii="Cambria" w:hAnsi="Cambria" w:cs="Times New Roman;Times New Roman"/>
+          <w:sz w:val="22"/>
+          <w:szCs w:val="22"/>
+          <w:lang w:val="en-US"/>
+        </w:rPr>
+        <w:t xml:space="preserve"> }}, </w:t>
+      </w:r>
+      <w:r>
+        <w:rPr>
+          <w:rFonts w:ascii="Cambria" w:hAnsi="Cambria" w:cs="Times New Roman;Times New Roman"/>
+          <w:sz w:val="22"/>
+          <w:szCs w:val="22"/>
+        </w:rPr>
+        <w:t>с</w:t>
+      </w:r>
+      <w:r>
+        <w:rPr>
+          <w:rFonts w:ascii="Cambria" w:hAnsi="Cambria" w:cs="Times New Roman;Times New Roman"/>
+          <w:sz w:val="22"/>
+          <w:szCs w:val="22"/>
+          <w:lang w:val="en-US"/>
+        </w:rPr>
+        <w:t xml:space="preserve"> </w:t>
+      </w:r>
+      <w:r>
+        <w:rPr>
+          <w:rFonts w:ascii="Cambria" w:hAnsi="Cambria" w:cs="Times New Roman;Times New Roman"/>
+          <w:sz w:val="22"/>
+          <w:szCs w:val="22"/>
+        </w:rPr>
+        <w:t>другой</w:t>
+      </w:r>
+      <w:r>
+        <w:rPr>
+          <w:rFonts w:ascii="Cambria" w:hAnsi="Cambria" w:cs="Times New Roman;Times New Roman"/>
+          <w:sz w:val="22"/>
+          <w:szCs w:val="22"/>
+          <w:lang w:val="en-US"/>
+        </w:rPr>
+        <w:t xml:space="preserve"> </w:t>
+      </w:r>
+      <w:r>
+        <w:rPr>
+          <w:rFonts w:ascii="Cambria" w:hAnsi="Cambria" w:cs="Times New Roman;Times New Roman"/>
+          <w:sz w:val="22"/>
+          <w:szCs w:val="22"/>
+        </w:rPr>
+        <w:t>стороны</w:t>
+      </w:r>
+      <w:r>
+        <w:rPr>
+          <w:rFonts w:ascii="Cambria" w:hAnsi="Cambria" w:cs="Times New Roman;Times New Roman"/>
+          <w:sz w:val="22"/>
+          <w:szCs w:val="22"/>
+          <w:lang w:val="en-US"/>
+        </w:rPr>
+        <w:t xml:space="preserve">, </w:t>
+      </w:r>
+      <w:r>
+        <w:rPr>
+          <w:rFonts w:ascii="Cambria" w:hAnsi="Cambria" w:cs="Times New Roman;Times New Roman"/>
+          <w:sz w:val="22"/>
+          <w:szCs w:val="22"/>
+        </w:rPr>
+        <w:t>совместно</w:t>
+      </w:r>
+      <w:r>
+        <w:rPr>
+          <w:rFonts w:ascii="Cambria" w:hAnsi="Cambria" w:cs="Times New Roman;Times New Roman"/>
+          <w:sz w:val="22"/>
+          <w:szCs w:val="22"/>
+          <w:lang w:val="en-US"/>
+        </w:rPr>
+        <w:t xml:space="preserve"> </w:t>
+      </w:r>
+      <w:r>
+        <w:rPr>
+          <w:rFonts w:ascii="Cambria" w:hAnsi="Cambria" w:cs="Times New Roman;Times New Roman"/>
+          <w:sz w:val="22"/>
+          <w:szCs w:val="22"/>
+        </w:rPr>
+        <w:t>именуемые</w:t>
+      </w:r>
+      <w:r>
+        <w:rPr>
+          <w:rFonts w:ascii="Cambria" w:hAnsi="Cambria" w:cs="Times New Roman;Times New Roman"/>
+          <w:sz w:val="22"/>
+          <w:szCs w:val="22"/>
+          <w:lang w:val="en-US"/>
+        </w:rPr>
+        <w:t xml:space="preserve"> "</w:t>
+      </w:r>
+      <w:r>
+        <w:rPr>
+          <w:rFonts w:ascii="Cambria" w:hAnsi="Cambria" w:cs="Times New Roman;Times New Roman"/>
+          <w:sz w:val="22"/>
+          <w:szCs w:val="22"/>
+        </w:rPr>
+        <w:t>Стороны</w:t>
+      </w:r>
+      <w:r>
+        <w:rPr>
+          <w:rFonts w:ascii="Cambria" w:hAnsi="Cambria" w:cs="Times New Roman;Times New Roman"/>
+          <w:sz w:val="22"/>
+          <w:szCs w:val="22"/>
+          <w:lang w:val="en-US"/>
+        </w:rPr>
+        <w:t xml:space="preserve">", </w:t>
+      </w:r>
+      <w:r>
+        <w:rPr>
+          <w:rFonts w:ascii="Cambria" w:hAnsi="Cambria" w:cs="Times New Roman;Times New Roman"/>
+          <w:sz w:val="22"/>
+          <w:szCs w:val="22"/>
+        </w:rPr>
+        <w:t>по</w:t>
+      </w:r>
+      <w:r>
+        <w:rPr>
+          <w:rFonts w:ascii="Cambria" w:hAnsi="Cambria" w:cs="Times New Roman;Times New Roman"/>
+          <w:sz w:val="22"/>
+          <w:szCs w:val="22"/>
+          <w:lang w:val="en-US"/>
+        </w:rPr>
+        <w:t xml:space="preserve"> </w:t>
+      </w:r>
+      <w:r>
+        <w:rPr>
+          <w:rFonts w:ascii="Cambria" w:hAnsi="Cambria" w:cs="Times New Roman;Times New Roman"/>
+          <w:sz w:val="22"/>
+          <w:szCs w:val="22"/>
+        </w:rPr>
+        <w:t>отдельности</w:t>
+      </w:r>
+      <w:r>
+        <w:rPr>
+          <w:rFonts w:ascii="Cambria" w:hAnsi="Cambria" w:cs="Times New Roman;Times New Roman"/>
+          <w:sz w:val="22"/>
+          <w:szCs w:val="22"/>
+          <w:lang w:val="en-US"/>
+        </w:rPr>
+        <w:t xml:space="preserve"> "</w:t>
+      </w:r>
+      <w:r>
+        <w:rPr>
+          <w:rFonts w:ascii="Cambria" w:hAnsi="Cambria" w:cs="Times New Roman;Times New Roman"/>
+          <w:sz w:val="22"/>
+          <w:szCs w:val="22"/>
+        </w:rPr>
+        <w:t>Сторона</w:t>
+      </w:r>
+      <w:r>
+        <w:rPr>
+          <w:rFonts w:ascii="Cambria" w:hAnsi="Cambria" w:cs="Times New Roman;Times New Roman"/>
+          <w:sz w:val="22"/>
+          <w:szCs w:val="22"/>
+          <w:lang w:val="en-US"/>
+        </w:rPr>
+        <w:t xml:space="preserve">", </w:t>
+      </w:r>
+      <w:r>
+        <w:rPr>
+          <w:rFonts w:ascii="Cambria" w:hAnsi="Cambria" w:cs="Times New Roman;Times New Roman"/>
+          <w:sz w:val="22"/>
+          <w:szCs w:val="22"/>
+        </w:rPr>
+        <w:t>заключили</w:t>
+      </w:r>
+      <w:r>
+        <w:rPr>
+          <w:rFonts w:ascii="Cambria" w:hAnsi="Cambria" w:cs="Times New Roman;Times New Roman"/>
+          <w:sz w:val="22"/>
+          <w:szCs w:val="22"/>
+          <w:lang w:val="en-US"/>
+        </w:rPr>
+        <w:t xml:space="preserve"> </w:t>
+      </w:r>
+      <w:r>
+        <w:rPr>
+          <w:rFonts w:ascii="Cambria" w:hAnsi="Cambria" w:cs="Times New Roman;Times New Roman"/>
+          <w:sz w:val="22"/>
+          <w:szCs w:val="22"/>
+        </w:rPr>
+        <w:t>настоящий</w:t>
+      </w:r>
+      <w:r>
+        <w:rPr>
+          <w:rFonts w:ascii="Cambria" w:hAnsi="Cambria" w:cs="Times New Roman;Times New Roman"/>
+          <w:sz w:val="22"/>
+          <w:szCs w:val="22"/>
+          <w:lang w:val="en-US"/>
+        </w:rPr>
+        <w:t xml:space="preserve"> </w:t>
+      </w:r>
+      <w:r>
+        <w:rPr>
+          <w:rFonts w:ascii="Cambria" w:hAnsi="Cambria" w:cs="Times New Roman;Times New Roman"/>
+          <w:sz w:val="22"/>
+          <w:szCs w:val="22"/>
+        </w:rPr>
+        <w:t>Договор</w:t>
+      </w:r>
+      <w:r>
+        <w:rPr>
+          <w:rFonts w:ascii="Cambria" w:hAnsi="Cambria" w:cs="Times New Roman;Times New Roman"/>
+          <w:sz w:val="22"/>
+          <w:szCs w:val="22"/>
+          <w:lang w:val="en-US"/>
+        </w:rPr>
+        <w:t xml:space="preserve"> </w:t>
+      </w:r>
+      <w:r>
+        <w:rPr>
+          <w:rFonts w:ascii="Cambria" w:hAnsi="Cambria" w:cs="Times New Roman;Times New Roman"/>
+          <w:sz w:val="22"/>
+          <w:szCs w:val="22"/>
+        </w:rPr>
+        <w:t>о</w:t>
+      </w:r>
+      <w:r>
+        <w:rPr>
+          <w:rFonts w:ascii="Cambria" w:hAnsi="Cambria" w:cs="Times New Roman;Times New Roman"/>
+          <w:sz w:val="22"/>
+          <w:szCs w:val="22"/>
+          <w:lang w:val="en-US"/>
+        </w:rPr>
+        <w:t xml:space="preserve"> </w:t>
+      </w:r>
+      <w:r>
+        <w:rPr>
+          <w:rFonts w:ascii="Cambria" w:hAnsi="Cambria" w:cs="Times New Roman;Times New Roman"/>
+          <w:sz w:val="22"/>
+          <w:szCs w:val="22"/>
+        </w:rPr>
+        <w:t>нижеследующем</w:t>
+      </w:r>
+      <w:r>
+        <w:rPr>
+          <w:rFonts w:ascii="Cambria" w:hAnsi="Cambria" w:cs="Times New Roman;Times New Roman"/>
+          <w:sz w:val="22"/>
+          <w:szCs w:val="22"/>
+          <w:lang w:val="en-US"/>
+        </w:rPr>
+        <w:t>:</w:t>
       </w:r>
     </w:p>
     <w:p>
@@ -128,6 +929,7 @@
           <w:rFonts w:ascii="Cambria" w:hAnsi="Cambria" w:cs="Times New Roman;Times New Roman"/>
           <w:sz w:val="22"/>
           <w:szCs w:val="22"/>
+          <w:lang w:val="en-US"/>
         </w:rPr>
       </w:pPr>
     </w:p>
@@ -180,7 +982,7 @@
           <w:sz w:val="22"/>
           <w:szCs w:val="22"/>
         </w:rPr>
-        <w:t xml:space="preserve">Исполнитель обязуется по заданию Заказчика оказать услуги {{ position.title_ru }} (далее - Услуги):</w:t>
+        <w:t>Исполнитель обязуется по заданию Заказчика оказать услуги {{ position.title_ru }} (далее - Услуги):</w:t>
       </w:r>
     </w:p>
     <w:p>
@@ -191,6 +993,7 @@
           <w:rFonts w:ascii="Cambria" w:hAnsi="Cambria" w:cs="Times New Roman;Times New Roman"/>
           <w:sz w:val="22"/>
           <w:szCs w:val="22"/>
+          <w:lang w:val="en-US"/>
         </w:rPr>
       </w:pPr>
       <w:r>
@@ -198,8 +1001,31 @@
           <w:rFonts w:ascii="Cambria" w:hAnsi="Cambria" w:cs="Times New Roman;Times New Roman"/>
           <w:sz w:val="22"/>
           <w:szCs w:val="22"/>
-        </w:rPr>
-        <w:t xml:space="preserve">{%p for duty in position.duties %}</w:t>
+          <w:lang w:val="en-US"/>
+        </w:rPr>
+        <w:t xml:space="preserve">{%p for duty in </w:t>
+      </w:r>
+      <w:proofErr w:type="spellStart"/>
+      <w:proofErr w:type="gramStart"/>
+      <w:r>
+        <w:rPr>
+          <w:rFonts w:ascii="Cambria" w:hAnsi="Cambria" w:cs="Times New Roman;Times New Roman"/>
+          <w:sz w:val="22"/>
+          <w:szCs w:val="22"/>
+          <w:lang w:val="en-US"/>
+        </w:rPr>
+        <w:t>position.duties</w:t>
+      </w:r>
+      <w:proofErr w:type="spellEnd"/>
+      <w:proofErr w:type="gramEnd"/>
+      <w:r>
+        <w:rPr>
+          <w:rFonts w:ascii="Cambria" w:hAnsi="Cambria" w:cs="Times New Roman;Times New Roman"/>
+          <w:sz w:val="22"/>
+          <w:szCs w:val="22"/>
+          <w:lang w:val="en-US"/>
+        </w:rPr>
+        <w:t xml:space="preserve"> %}</w:t>
       </w:r>
     </w:p>
     <w:p>
@@ -212,13 +1038,33 @@
           <w:szCs w:val="22"/>
         </w:rPr>
       </w:pPr>
-      <w:r>
-        <w:rPr>
-          <w:rFonts w:ascii="Cambria" w:hAnsi="Cambria" w:cs="Times New Roman;Times New Roman"/>
-          <w:sz w:val="22"/>
-          <w:szCs w:val="22"/>
-        </w:rPr>
-        <w:t xml:space="preserve">{{ duty }}</w:t>
+      <w:proofErr w:type="gramStart"/>
+      <w:r>
+        <w:rPr>
+          <w:rFonts w:ascii="Cambria" w:hAnsi="Cambria" w:cs="Times New Roman;Times New Roman"/>
+          <w:sz w:val="22"/>
+          <w:szCs w:val="22"/>
+        </w:rPr>
+        <w:t xml:space="preserve">{{ </w:t>
+      </w:r>
+      <w:proofErr w:type="spellStart"/>
+      <w:r>
+        <w:rPr>
+          <w:rFonts w:ascii="Cambria" w:hAnsi="Cambria" w:cs="Times New Roman;Times New Roman"/>
+          <w:sz w:val="22"/>
+          <w:szCs w:val="22"/>
+        </w:rPr>
+        <w:t>duty</w:t>
+      </w:r>
+      <w:proofErr w:type="spellEnd"/>
+      <w:proofErr w:type="gramEnd"/>
+      <w:r>
+        <w:rPr>
+          <w:rFonts w:ascii="Cambria" w:hAnsi="Cambria" w:cs="Times New Roman;Times New Roman"/>
+          <w:sz w:val="22"/>
+          <w:szCs w:val="22"/>
+        </w:rPr>
+        <w:t xml:space="preserve"> }}</w:t>
       </w:r>
     </w:p>
     <w:p>
@@ -237,7 +1083,7 @@
           <w:sz w:val="22"/>
           <w:szCs w:val="22"/>
         </w:rPr>
-        <w:t xml:space="preserve">{%p endfor %}</w:t>
+        <w:t>{%p endfor %}</w:t>
       </w:r>
     </w:p>
     <w:p>
@@ -679,7 +1525,6 @@
           <w:sz w:val="22"/>
           <w:szCs w:val="22"/>
         </w:rPr>
-        <w:lastRenderedPageBreak/>
         <w:t>4. Сроки оказания Услуг</w:t>
       </w:r>
     </w:p>
@@ -721,6 +1566,7 @@
           <w:rFonts w:ascii="Cambria" w:hAnsi="Cambria" w:cs="Times New Roman;Times New Roman"/>
           <w:sz w:val="22"/>
           <w:szCs w:val="22"/>
+          <w:lang w:val="en-US"/>
         </w:rPr>
       </w:pPr>
       <w:r>
@@ -728,8 +1574,121 @@
           <w:rFonts w:ascii="Cambria" w:hAnsi="Cambria" w:cs="Times New Roman;Times New Roman"/>
           <w:sz w:val="22"/>
           <w:szCs w:val="22"/>
-        </w:rPr>
-        <w:t>4.1.1. Начало оказания Услуг - {{ fmt_date_long_ru(contract.sign_date) }}</w:t>
+          <w:lang w:val="en-US"/>
+        </w:rPr>
+        <w:lastRenderedPageBreak/>
+        <w:t xml:space="preserve">4.1.1. </w:t>
+      </w:r>
+      <w:r>
+        <w:rPr>
+          <w:rFonts w:ascii="Cambria" w:hAnsi="Cambria" w:cs="Times New Roman;Times New Roman"/>
+          <w:sz w:val="22"/>
+          <w:szCs w:val="22"/>
+        </w:rPr>
+        <w:t>Начало</w:t>
+      </w:r>
+      <w:r>
+        <w:rPr>
+          <w:rFonts w:ascii="Cambria" w:hAnsi="Cambria" w:cs="Times New Roman;Times New Roman"/>
+          <w:sz w:val="22"/>
+          <w:szCs w:val="22"/>
+          <w:lang w:val="en-US"/>
+        </w:rPr>
+        <w:t xml:space="preserve"> </w:t>
+      </w:r>
+      <w:r>
+        <w:rPr>
+          <w:rFonts w:ascii="Cambria" w:hAnsi="Cambria" w:cs="Times New Roman;Times New Roman"/>
+          <w:sz w:val="22"/>
+          <w:szCs w:val="22"/>
+        </w:rPr>
+        <w:t>оказания</w:t>
+      </w:r>
+      <w:r>
+        <w:rPr>
+          <w:rFonts w:ascii="Cambria" w:hAnsi="Cambria" w:cs="Times New Roman;Times New Roman"/>
+          <w:sz w:val="22"/>
+          <w:szCs w:val="22"/>
+          <w:lang w:val="en-US"/>
+        </w:rPr>
+        <w:t xml:space="preserve"> </w:t>
+      </w:r>
+      <w:r>
+        <w:rPr>
+          <w:rFonts w:ascii="Cambria" w:hAnsi="Cambria" w:cs="Times New Roman;Times New Roman"/>
+          <w:sz w:val="22"/>
+          <w:szCs w:val="22"/>
+        </w:rPr>
+        <w:t>Услуг</w:t>
+      </w:r>
+      <w:r>
+        <w:rPr>
+          <w:rFonts w:ascii="Cambria" w:hAnsi="Cambria" w:cs="Times New Roman;Times New Roman"/>
+          <w:sz w:val="22"/>
+          <w:szCs w:val="22"/>
+          <w:lang w:val="en-US"/>
+        </w:rPr>
+        <w:t xml:space="preserve"> - </w:t>
+      </w:r>
+      <w:proofErr w:type="gramStart"/>
+      <w:r>
+        <w:rPr>
+          <w:rFonts w:ascii="Cambria" w:hAnsi="Cambria" w:cs="Times New Roman;Times New Roman"/>
+          <w:sz w:val="22"/>
+          <w:szCs w:val="22"/>
+          <w:lang w:val="en-US"/>
+        </w:rPr>
+        <w:t xml:space="preserve">{{ </w:t>
+      </w:r>
+      <w:proofErr w:type="spellStart"/>
+      <w:r>
+        <w:rPr>
+          <w:rFonts w:ascii="Cambria" w:hAnsi="Cambria" w:cs="Times New Roman;Times New Roman"/>
+          <w:sz w:val="22"/>
+          <w:szCs w:val="22"/>
+          <w:lang w:val="en-US"/>
+        </w:rPr>
+        <w:t>fmt</w:t>
+      </w:r>
+      <w:proofErr w:type="gramEnd"/>
+      <w:r>
+        <w:rPr>
+          <w:rFonts w:ascii="Cambria" w:hAnsi="Cambria" w:cs="Times New Roman;Times New Roman"/>
+          <w:sz w:val="22"/>
+          <w:szCs w:val="22"/>
+          <w:lang w:val="en-US"/>
+        </w:rPr>
+        <w:t>_date_long_ru</w:t>
+      </w:r>
+      <w:proofErr w:type="spellEnd"/>
+      <w:r>
+        <w:rPr>
+          <w:rFonts w:ascii="Cambria" w:hAnsi="Cambria" w:cs="Times New Roman;Times New Roman"/>
+          <w:sz w:val="22"/>
+          <w:szCs w:val="22"/>
+          <w:lang w:val="en-US"/>
+        </w:rPr>
+        <w:t>(</w:t>
+      </w:r>
+      <w:proofErr w:type="spellStart"/>
+      <w:r>
+        <w:rPr>
+          <w:rFonts w:ascii="Cambria" w:hAnsi="Cambria" w:cs="Times New Roman;Times New Roman"/>
+          <w:sz w:val="22"/>
+          <w:szCs w:val="22"/>
+          <w:lang w:val="en-US"/>
+        </w:rPr>
+        <w:t>contract.sign_date</w:t>
+      </w:r>
+      <w:proofErr w:type="spellEnd"/>
+      <w:r>
+        <w:rPr>
+          <w:rFonts w:ascii="Cambria" w:hAnsi="Cambria" w:cs="Times New Roman;Times New Roman"/>
+          <w:sz w:val="22"/>
+          <w:szCs w:val="22"/>
+          <w:lang w:val="en-US"/>
+        </w:rPr>
+        <w:t>) }}</w:t>
       </w:r>
     </w:p>
     <w:p>
@@ -740,6 +1699,7 @@
           <w:rFonts w:ascii="Cambria" w:hAnsi="Cambria" w:cs="Times New Roman;Times New Roman"/>
           <w:sz w:val="22"/>
           <w:szCs w:val="22"/>
+          <w:lang w:val="en-US"/>
         </w:rPr>
       </w:pPr>
       <w:r>
@@ -747,8 +1707,120 @@
           <w:rFonts w:ascii="Cambria" w:hAnsi="Cambria" w:cs="Times New Roman;Times New Roman"/>
           <w:sz w:val="22"/>
           <w:szCs w:val="22"/>
-        </w:rPr>
-        <w:t>4.1.2. Окончание оказания Услуг - {{ fmt_date_long_ru(contract.end_date) }}</w:t>
+          <w:lang w:val="en-US"/>
+        </w:rPr>
+        <w:t xml:space="preserve">4.1.2. </w:t>
+      </w:r>
+      <w:r>
+        <w:rPr>
+          <w:rFonts w:ascii="Cambria" w:hAnsi="Cambria" w:cs="Times New Roman;Times New Roman"/>
+          <w:sz w:val="22"/>
+          <w:szCs w:val="22"/>
+        </w:rPr>
+        <w:t>Окончание</w:t>
+      </w:r>
+      <w:r>
+        <w:rPr>
+          <w:rFonts w:ascii="Cambria" w:hAnsi="Cambria" w:cs="Times New Roman;Times New Roman"/>
+          <w:sz w:val="22"/>
+          <w:szCs w:val="22"/>
+          <w:lang w:val="en-US"/>
+        </w:rPr>
+        <w:t xml:space="preserve"> </w:t>
+      </w:r>
+      <w:r>
+        <w:rPr>
+          <w:rFonts w:ascii="Cambria" w:hAnsi="Cambria" w:cs="Times New Roman;Times New Roman"/>
+          <w:sz w:val="22"/>
+          <w:szCs w:val="22"/>
+        </w:rPr>
+        <w:t>оказания</w:t>
+      </w:r>
+      <w:r>
+        <w:rPr>
+          <w:rFonts w:ascii="Cambria" w:hAnsi="Cambria" w:cs="Times New Roman;Times New Roman"/>
+          <w:sz w:val="22"/>
+          <w:szCs w:val="22"/>
+          <w:lang w:val="en-US"/>
+        </w:rPr>
+        <w:t xml:space="preserve"> </w:t>
+      </w:r>
+      <w:r>
+        <w:rPr>
+          <w:rFonts w:ascii="Cambria" w:hAnsi="Cambria" w:cs="Times New Roman;Times New Roman"/>
+          <w:sz w:val="22"/>
+          <w:szCs w:val="22"/>
+        </w:rPr>
+        <w:t>Услуг</w:t>
+      </w:r>
+      <w:r>
+        <w:rPr>
+          <w:rFonts w:ascii="Cambria" w:hAnsi="Cambria" w:cs="Times New Roman;Times New Roman"/>
+          <w:sz w:val="22"/>
+          <w:szCs w:val="22"/>
+          <w:lang w:val="en-US"/>
+        </w:rPr>
+        <w:t xml:space="preserve"> - </w:t>
+      </w:r>
+      <w:proofErr w:type="gramStart"/>
+      <w:r>
+        <w:rPr>
+          <w:rFonts w:ascii="Cambria" w:hAnsi="Cambria" w:cs="Times New Roman;Times New Roman"/>
+          <w:sz w:val="22"/>
+          <w:szCs w:val="22"/>
+          <w:lang w:val="en-US"/>
+        </w:rPr>
+        <w:t xml:space="preserve">{{ </w:t>
+      </w:r>
+      <w:proofErr w:type="spellStart"/>
+      <w:r>
+        <w:rPr>
+          <w:rFonts w:ascii="Cambria" w:hAnsi="Cambria" w:cs="Times New Roman;Times New Roman"/>
+          <w:sz w:val="22"/>
+          <w:szCs w:val="22"/>
+          <w:lang w:val="en-US"/>
+        </w:rPr>
+        <w:t>fmt</w:t>
+      </w:r>
+      <w:proofErr w:type="gramEnd"/>
+      <w:r>
+        <w:rPr>
+          <w:rFonts w:ascii="Cambria" w:hAnsi="Cambria" w:cs="Times New Roman;Times New Roman"/>
+          <w:sz w:val="22"/>
+          <w:szCs w:val="22"/>
+          <w:lang w:val="en-US"/>
+        </w:rPr>
+        <w:t>_date_long_ru</w:t>
+      </w:r>
+      <w:proofErr w:type="spellEnd"/>
+      <w:r>
+        <w:rPr>
+          <w:rFonts w:ascii="Cambria" w:hAnsi="Cambria" w:cs="Times New Roman;Times New Roman"/>
+          <w:sz w:val="22"/>
+          <w:szCs w:val="22"/>
+          <w:lang w:val="en-US"/>
+        </w:rPr>
+        <w:t>(</w:t>
+      </w:r>
+      <w:proofErr w:type="spellStart"/>
+      <w:r>
+        <w:rPr>
+          <w:rFonts w:ascii="Cambria" w:hAnsi="Cambria" w:cs="Times New Roman;Times New Roman"/>
+          <w:sz w:val="22"/>
+          <w:szCs w:val="22"/>
+          <w:lang w:val="en-US"/>
+        </w:rPr>
+        <w:t>contract.end_date</w:t>
+      </w:r>
+      <w:proofErr w:type="spellEnd"/>
+      <w:r>
+        <w:rPr>
+          <w:rFonts w:ascii="Cambria" w:hAnsi="Cambria" w:cs="Times New Roman;Times New Roman"/>
+          <w:sz w:val="22"/>
+          <w:szCs w:val="22"/>
+          <w:lang w:val="en-US"/>
+        </w:rPr>
+        <w:t>) }}</w:t>
       </w:r>
     </w:p>
     <w:p>
@@ -759,6 +1831,7 @@
           <w:rFonts w:ascii="Cambria" w:hAnsi="Cambria" w:cs="Times New Roman;Times New Roman"/>
           <w:sz w:val="22"/>
           <w:szCs w:val="22"/>
+          <w:lang w:val="en-US"/>
         </w:rPr>
       </w:pPr>
     </w:p>
@@ -1044,6 +2117,30 @@
           <w:szCs w:val="22"/>
         </w:rPr>
       </w:pPr>
+    </w:p>
+    <w:p>
+      <w:pPr>
+        <w:pStyle w:val="ConsNormal"/>
+        <w:jc w:val="center"/>
+        <w:rPr>
+          <w:rFonts w:ascii="Cambria" w:hAnsi="Cambria" w:cs="Times New Roman;Times New Roman"/>
+          <w:sz w:val="22"/>
+          <w:szCs w:val="22"/>
+        </w:rPr>
+      </w:pPr>
+    </w:p>
+    <w:p>
+      <w:pPr>
+        <w:pStyle w:val="ConsNormal"/>
+        <w:jc w:val="center"/>
+        <w:rPr>
+          <w:rFonts w:ascii="Cambria" w:hAnsi="Cambria" w:cs="Times New Roman;Times New Roman"/>
+          <w:sz w:val="22"/>
+          <w:szCs w:val="22"/>
+        </w:rPr>
+      </w:pPr>
+      <w:bookmarkStart w:id="0" w:name="_GoBack"/>
+      <w:bookmarkEnd w:id="0"/>
       <w:r>
         <w:rPr>
           <w:rFonts w:ascii="Cambria" w:hAnsi="Cambria" w:cs="Times New Roman;Times New Roman"/>
@@ -1164,15 +2261,28 @@
                 <w:rFonts w:ascii="Cambria" w:hAnsi="Cambria"/>
                 <w:sz w:val="22"/>
                 <w:szCs w:val="22"/>
+                <w:lang w:val="en-US"/>
               </w:rPr>
             </w:pPr>
+            <w:proofErr w:type="gramStart"/>
             <w:r>
               <w:rPr>
                 <w:rFonts w:ascii="Cambria" w:hAnsi="Cambria"/>
                 <w:sz w:val="22"/>
                 <w:szCs w:val="22"/>
+                <w:lang w:val="en-US"/>
               </w:rPr>
-              <w:t xml:space="preserve">{{ company.legal_address_line1 }} </w:t>
+              <w:t>{{ company</w:t>
+            </w:r>
+            <w:proofErr w:type="gramEnd"/>
+            <w:r>
+              <w:rPr>
+                <w:rFonts w:ascii="Cambria" w:hAnsi="Cambria"/>
+                <w:sz w:val="22"/>
+                <w:szCs w:val="22"/>
+                <w:lang w:val="en-US"/>
+              </w:rPr>
+              <w:t xml:space="preserve">.legal_address_line1 }} </w:t>
             </w:r>
           </w:p>
           <w:p>
@@ -1183,15 +2293,28 @@
                 <w:rFonts w:ascii="Cambria" w:hAnsi="Cambria"/>
                 <w:sz w:val="22"/>
                 <w:szCs w:val="22"/>
+                <w:lang w:val="en-US"/>
               </w:rPr>
             </w:pPr>
+            <w:proofErr w:type="gramStart"/>
             <w:r>
               <w:rPr>
                 <w:rFonts w:ascii="Cambria" w:hAnsi="Cambria"/>
                 <w:sz w:val="22"/>
                 <w:szCs w:val="22"/>
+                <w:lang w:val="en-US"/>
               </w:rPr>
-              <w:t>{{ company.legal_address_line2 }}</w:t>
+              <w:t>{{ company</w:t>
+            </w:r>
+            <w:proofErr w:type="gramEnd"/>
+            <w:r>
+              <w:rPr>
+                <w:rFonts w:ascii="Cambria" w:hAnsi="Cambria"/>
+                <w:sz w:val="22"/>
+                <w:szCs w:val="22"/>
+                <w:lang w:val="en-US"/>
+              </w:rPr>
+              <w:t>.legal_address_line2 }}</w:t>
             </w:r>
           </w:p>
           <w:p>
@@ -1202,6 +2325,7 @@
                 <w:rFonts w:ascii="Cambria" w:hAnsi="Cambria"/>
                 <w:sz w:val="22"/>
                 <w:szCs w:val="22"/>
+                <w:lang w:val="en-US"/>
               </w:rPr>
             </w:pPr>
             <w:r>
@@ -1209,8 +2333,83 @@
                 <w:rFonts w:ascii="Cambria" w:hAnsi="Cambria"/>
                 <w:sz w:val="22"/>
                 <w:szCs w:val="22"/>
+                <w:lang w:val="en-US"/>
               </w:rPr>
-              <w:t xml:space="preserve"> р/с {{ company.bank_account }} </w:t>
+              <w:t xml:space="preserve"> </w:t>
+            </w:r>
+            <w:r>
+              <w:rPr>
+                <w:rFonts w:ascii="Cambria" w:hAnsi="Cambria"/>
+                <w:sz w:val="22"/>
+                <w:szCs w:val="22"/>
+              </w:rPr>
+              <w:t>р</w:t>
+            </w:r>
+            <w:r>
+              <w:rPr>
+                <w:rFonts w:ascii="Cambria" w:hAnsi="Cambria"/>
+                <w:sz w:val="22"/>
+                <w:szCs w:val="22"/>
+                <w:lang w:val="en-US"/>
+              </w:rPr>
+              <w:t>/</w:t>
+            </w:r>
+            <w:r>
+              <w:rPr>
+                <w:rFonts w:ascii="Cambria" w:hAnsi="Cambria"/>
+                <w:sz w:val="22"/>
+                <w:szCs w:val="22"/>
+              </w:rPr>
+              <w:t>с</w:t>
+            </w:r>
+            <w:r>
+              <w:rPr>
+                <w:rFonts w:ascii="Cambria" w:hAnsi="Cambria"/>
+                <w:sz w:val="22"/>
+                <w:szCs w:val="22"/>
+                <w:lang w:val="en-US"/>
+              </w:rPr>
+              <w:t xml:space="preserve"> </w:t>
+            </w:r>
+            <w:proofErr w:type="gramStart"/>
+            <w:r>
+              <w:rPr>
+                <w:rFonts w:ascii="Cambria" w:hAnsi="Cambria"/>
+                <w:sz w:val="22"/>
+                <w:szCs w:val="22"/>
+                <w:lang w:val="en-US"/>
+              </w:rPr>
+              <w:t xml:space="preserve">{{ </w:t>
+            </w:r>
+            <w:proofErr w:type="spellStart"/>
+            <w:r>
+              <w:rPr>
+                <w:rFonts w:ascii="Cambria" w:hAnsi="Cambria"/>
+                <w:sz w:val="22"/>
+                <w:szCs w:val="22"/>
+                <w:lang w:val="en-US"/>
+              </w:rPr>
+              <w:t>company</w:t>
+            </w:r>
+            <w:proofErr w:type="gramEnd"/>
+            <w:r>
+              <w:rPr>
+                <w:rFonts w:ascii="Cambria" w:hAnsi="Cambria"/>
+                <w:sz w:val="22"/>
+                <w:szCs w:val="22"/>
+                <w:lang w:val="en-US"/>
+              </w:rPr>
+              <w:t>.bank_account</w:t>
+            </w:r>
+            <w:proofErr w:type="spellEnd"/>
+            <w:r>
+              <w:rPr>
+                <w:rFonts w:ascii="Cambria" w:hAnsi="Cambria"/>
+                <w:sz w:val="22"/>
+                <w:szCs w:val="22"/>
+                <w:lang w:val="en-US"/>
+              </w:rPr>
+              <w:t xml:space="preserve"> }} </w:t>
             </w:r>
           </w:p>
           <w:p>
@@ -1221,15 +2420,48 @@
                 <w:rFonts w:ascii="Cambria" w:hAnsi="Cambria"/>
                 <w:sz w:val="22"/>
                 <w:szCs w:val="22"/>
+                <w:lang w:val="en-US"/>
               </w:rPr>
             </w:pPr>
+            <w:proofErr w:type="gramStart"/>
             <w:r>
               <w:rPr>
                 <w:rFonts w:ascii="Cambria" w:hAnsi="Cambria"/>
                 <w:sz w:val="22"/>
                 <w:szCs w:val="22"/>
+                <w:lang w:val="en-US"/>
               </w:rPr>
-              <w:t>{{ company.bank_name }}</w:t>
+              <w:t xml:space="preserve">{{ </w:t>
+            </w:r>
+            <w:proofErr w:type="spellStart"/>
+            <w:r>
+              <w:rPr>
+                <w:rFonts w:ascii="Cambria" w:hAnsi="Cambria"/>
+                <w:sz w:val="22"/>
+                <w:szCs w:val="22"/>
+                <w:lang w:val="en-US"/>
+              </w:rPr>
+              <w:t>company</w:t>
+            </w:r>
+            <w:proofErr w:type="gramEnd"/>
+            <w:r>
+              <w:rPr>
+                <w:rFonts w:ascii="Cambria" w:hAnsi="Cambria"/>
+                <w:sz w:val="22"/>
+                <w:szCs w:val="22"/>
+                <w:lang w:val="en-US"/>
+              </w:rPr>
+              <w:t>.bank_name</w:t>
+            </w:r>
+            <w:proofErr w:type="spellEnd"/>
+            <w:r>
+              <w:rPr>
+                <w:rFonts w:ascii="Cambria" w:hAnsi="Cambria"/>
+                <w:sz w:val="22"/>
+                <w:szCs w:val="22"/>
+                <w:lang w:val="en-US"/>
+              </w:rPr>
+              <w:t xml:space="preserve"> }}</w:t>
             </w:r>
           </w:p>
           <w:p>
@@ -1240,6 +2472,7 @@
                 <w:rFonts w:ascii="Cambria" w:hAnsi="Cambria"/>
                 <w:sz w:val="22"/>
                 <w:szCs w:val="22"/>
+                <w:lang w:val="en-US"/>
               </w:rPr>
             </w:pPr>
             <w:r>
@@ -1248,7 +2481,73 @@
                 <w:sz w:val="22"/>
                 <w:szCs w:val="22"/>
               </w:rPr>
-              <w:t>к/с {{ company.bank_correspondent_account }},</w:t>
+              <w:t>к</w:t>
+            </w:r>
+            <w:r>
+              <w:rPr>
+                <w:rFonts w:ascii="Cambria" w:hAnsi="Cambria"/>
+                <w:sz w:val="22"/>
+                <w:szCs w:val="22"/>
+                <w:lang w:val="en-US"/>
+              </w:rPr>
+              <w:t>/</w:t>
+            </w:r>
+            <w:r>
+              <w:rPr>
+                <w:rFonts w:ascii="Cambria" w:hAnsi="Cambria"/>
+                <w:sz w:val="22"/>
+                <w:szCs w:val="22"/>
+              </w:rPr>
+              <w:t>с</w:t>
+            </w:r>
+            <w:r>
+              <w:rPr>
+                <w:rFonts w:ascii="Cambria" w:hAnsi="Cambria"/>
+                <w:sz w:val="22"/>
+                <w:szCs w:val="22"/>
+                <w:lang w:val="en-US"/>
+              </w:rPr>
+              <w:t xml:space="preserve"> </w:t>
+            </w:r>
+            <w:proofErr w:type="gramStart"/>
+            <w:r>
+              <w:rPr>
+                <w:rFonts w:ascii="Cambria" w:hAnsi="Cambria"/>
+                <w:sz w:val="22"/>
+                <w:szCs w:val="22"/>
+                <w:lang w:val="en-US"/>
+              </w:rPr>
+              <w:t xml:space="preserve">{{ </w:t>
+            </w:r>
+            <w:proofErr w:type="spellStart"/>
+            <w:r>
+              <w:rPr>
+                <w:rFonts w:ascii="Cambria" w:hAnsi="Cambria"/>
+                <w:sz w:val="22"/>
+                <w:szCs w:val="22"/>
+                <w:lang w:val="en-US"/>
+              </w:rPr>
+              <w:t>company</w:t>
+            </w:r>
+            <w:proofErr w:type="gramEnd"/>
+            <w:r>
+              <w:rPr>
+                <w:rFonts w:ascii="Cambria" w:hAnsi="Cambria"/>
+                <w:sz w:val="22"/>
+                <w:szCs w:val="22"/>
+                <w:lang w:val="en-US"/>
+              </w:rPr>
+              <w:t>.bank_correspondent_account</w:t>
+            </w:r>
+            <w:proofErr w:type="spellEnd"/>
+            <w:r>
+              <w:rPr>
+                <w:rFonts w:ascii="Cambria" w:hAnsi="Cambria"/>
+                <w:sz w:val="22"/>
+                <w:szCs w:val="22"/>
+                <w:lang w:val="en-US"/>
+              </w:rPr>
+              <w:t xml:space="preserve"> }},</w:t>
             </w:r>
           </w:p>
           <w:p>
@@ -1268,7 +2567,43 @@
                 <w:sz w:val="22"/>
                 <w:szCs w:val="22"/>
               </w:rPr>
-              <w:t>БИК {{ company.bank_bic }}</w:t>
+              <w:t xml:space="preserve">БИК </w:t>
+            </w:r>
+            <w:proofErr w:type="gramStart"/>
+            <w:r>
+              <w:rPr>
+                <w:rFonts w:ascii="Cambria" w:hAnsi="Cambria"/>
+                <w:sz w:val="22"/>
+                <w:szCs w:val="22"/>
+              </w:rPr>
+              <w:t xml:space="preserve">{{ </w:t>
+            </w:r>
+            <w:proofErr w:type="spellStart"/>
+            <w:r>
+              <w:rPr>
+                <w:rFonts w:ascii="Cambria" w:hAnsi="Cambria"/>
+                <w:sz w:val="22"/>
+                <w:szCs w:val="22"/>
+              </w:rPr>
+              <w:t>company</w:t>
+            </w:r>
+            <w:proofErr w:type="gramEnd"/>
+            <w:r>
+              <w:rPr>
+                <w:rFonts w:ascii="Cambria" w:hAnsi="Cambria"/>
+                <w:sz w:val="22"/>
+                <w:szCs w:val="22"/>
+              </w:rPr>
+              <w:t>.bank_bic</w:t>
+            </w:r>
+            <w:proofErr w:type="spellEnd"/>
+            <w:r>
+              <w:rPr>
+                <w:rFonts w:ascii="Cambria" w:hAnsi="Cambria"/>
+                <w:sz w:val="22"/>
+                <w:szCs w:val="22"/>
+              </w:rPr>
+              <w:t xml:space="preserve"> }}</w:t>
             </w:r>
             <w:r>
               <w:rPr>
@@ -1304,6 +2639,7 @@
                 <w:rFonts w:ascii="Cambria" w:hAnsi="Cambria" w:cs="Times New Roman;Times New Roman"/>
                 <w:sz w:val="22"/>
                 <w:szCs w:val="22"/>
+                <w:lang w:val="en-US"/>
               </w:rPr>
             </w:pPr>
             <w:r>
@@ -1312,7 +2648,16 @@
                 <w:sz w:val="22"/>
                 <w:szCs w:val="22"/>
               </w:rPr>
-              <w:t>Исполнитель:</w:t>
+              <w:t>Исполнитель</w:t>
+            </w:r>
+            <w:r>
+              <w:rPr>
+                <w:rFonts w:ascii="Cambria" w:hAnsi="Cambria" w:cs="Times New Roman;Times New Roman"/>
+                <w:sz w:val="22"/>
+                <w:szCs w:val="22"/>
+                <w:lang w:val="en-US"/>
+              </w:rPr>
+              <w:t>:</w:t>
             </w:r>
           </w:p>
           <w:p>
@@ -1323,6 +2668,7 @@
                 <w:rFonts w:ascii="Cambria" w:hAnsi="Cambria" w:cs="Times New Roman;Times New Roman"/>
                 <w:sz w:val="22"/>
                 <w:szCs w:val="22"/>
+                <w:lang w:val="en-US"/>
               </w:rPr>
             </w:pPr>
           </w:p>
@@ -1338,6 +2684,63 @@
                 <w:rFonts w:ascii="Cambria" w:hAnsi="Cambria" w:cs="Times New Roman;Times New Roman"/>
                 <w:sz w:val="22"/>
                 <w:szCs w:val="22"/>
+                <w:lang w:val="en-US"/>
+              </w:rPr>
+            </w:pPr>
+            <w:proofErr w:type="gramStart"/>
+            <w:r>
+              <w:rPr>
+                <w:rFonts w:ascii="Cambria" w:hAnsi="Cambria" w:cs="Times New Roman;Times New Roman"/>
+                <w:sz w:val="22"/>
+                <w:szCs w:val="22"/>
+                <w:lang w:val="en-US"/>
+              </w:rPr>
+              <w:t xml:space="preserve">{{ </w:t>
+            </w:r>
+            <w:proofErr w:type="spellStart"/>
+            <w:r>
+              <w:rPr>
+                <w:rFonts w:ascii="Cambria" w:hAnsi="Cambria" w:cs="Times New Roman;Times New Roman"/>
+                <w:sz w:val="22"/>
+                <w:szCs w:val="22"/>
+                <w:lang w:val="en-US"/>
+              </w:rPr>
+              <w:t>applicant</w:t>
+            </w:r>
+            <w:proofErr w:type="gramEnd"/>
+            <w:r>
+              <w:rPr>
+                <w:rFonts w:ascii="Cambria" w:hAnsi="Cambria" w:cs="Times New Roman;Times New Roman"/>
+                <w:sz w:val="22"/>
+                <w:szCs w:val="22"/>
+                <w:lang w:val="en-US"/>
+              </w:rPr>
+              <w:t>.full_name_native</w:t>
+            </w:r>
+            <w:proofErr w:type="spellEnd"/>
+            <w:r>
+              <w:rPr>
+                <w:rFonts w:ascii="Cambria" w:hAnsi="Cambria" w:cs="Times New Roman;Times New Roman"/>
+                <w:sz w:val="22"/>
+                <w:szCs w:val="22"/>
+                <w:lang w:val="en-US"/>
+              </w:rPr>
+              <w:t xml:space="preserve"> }}</w:t>
+            </w:r>
+          </w:p>
+          <w:p>
+            <w:pPr>
+              <w:pStyle w:val="ConsNormal"/>
+              <w:tabs>
+                <w:tab w:val="left" w:pos="1635"/>
+              </w:tabs>
+              <w:ind w:left="40"/>
+              <w:jc w:val="left"/>
+              <w:rPr>
+                <w:rFonts w:ascii="Cambria" w:hAnsi="Cambria" w:cs="Times New Roman;Times New Roman"/>
+                <w:sz w:val="22"/>
+                <w:szCs w:val="22"/>
+                <w:lang w:val="en-US"/>
               </w:rPr>
             </w:pPr>
             <w:r>
@@ -1346,7 +2749,279 @@
                 <w:sz w:val="22"/>
                 <w:szCs w:val="22"/>
               </w:rPr>
-              <w:t>{{ applicant.full_name_native }}</w:t>
+              <w:t>паспорт</w:t>
+            </w:r>
+            <w:r>
+              <w:rPr>
+                <w:rFonts w:ascii="Cambria" w:hAnsi="Cambria" w:cs="Times New Roman;Times New Roman"/>
+                <w:sz w:val="22"/>
+                <w:szCs w:val="22"/>
+                <w:lang w:val="en-US"/>
+              </w:rPr>
+              <w:t xml:space="preserve"> </w:t>
+            </w:r>
+            <w:proofErr w:type="gramStart"/>
+            <w:r>
+              <w:rPr>
+                <w:rFonts w:ascii="Cambria" w:hAnsi="Cambria" w:cs="Times New Roman;Times New Roman"/>
+                <w:sz w:val="22"/>
+                <w:szCs w:val="22"/>
+                <w:lang w:val="en-US"/>
+              </w:rPr>
+              <w:t xml:space="preserve">{{ </w:t>
+            </w:r>
+            <w:proofErr w:type="spellStart"/>
+            <w:r>
+              <w:rPr>
+                <w:rFonts w:ascii="Cambria" w:hAnsi="Cambria" w:cs="Times New Roman;Times New Roman"/>
+                <w:sz w:val="22"/>
+                <w:szCs w:val="22"/>
+                <w:lang w:val="en-US"/>
+              </w:rPr>
+              <w:t>applicant</w:t>
+            </w:r>
+            <w:proofErr w:type="gramEnd"/>
+            <w:r>
+              <w:rPr>
+                <w:rFonts w:ascii="Cambria" w:hAnsi="Cambria" w:cs="Times New Roman;Times New Roman"/>
+                <w:sz w:val="22"/>
+                <w:szCs w:val="22"/>
+                <w:lang w:val="en-US"/>
+              </w:rPr>
+              <w:t>.passport_formatted</w:t>
+            </w:r>
+            <w:proofErr w:type="spellEnd"/>
+            <w:r>
+              <w:rPr>
+                <w:rFonts w:ascii="Cambria" w:hAnsi="Cambria" w:cs="Times New Roman;Times New Roman"/>
+                <w:sz w:val="22"/>
+                <w:szCs w:val="22"/>
+                <w:lang w:val="en-US"/>
+              </w:rPr>
+              <w:t xml:space="preserve"> }}, </w:t>
+            </w:r>
+            <w:r>
+              <w:rPr>
+                <w:rFonts w:ascii="Cambria" w:hAnsi="Cambria" w:cs="Times New Roman;Times New Roman"/>
+                <w:sz w:val="22"/>
+                <w:szCs w:val="22"/>
+              </w:rPr>
+              <w:t>выдан</w:t>
+            </w:r>
+            <w:r>
+              <w:rPr>
+                <w:rFonts w:ascii="Cambria" w:hAnsi="Cambria" w:cs="Times New Roman;Times New Roman"/>
+                <w:sz w:val="22"/>
+                <w:szCs w:val="22"/>
+                <w:lang w:val="en-US"/>
+              </w:rPr>
+              <w:t xml:space="preserve"> {{ </w:t>
+            </w:r>
+            <w:proofErr w:type="spellStart"/>
+            <w:r>
+              <w:rPr>
+                <w:rFonts w:ascii="Cambria" w:hAnsi="Cambria" w:cs="Times New Roman;Times New Roman"/>
+                <w:sz w:val="22"/>
+                <w:szCs w:val="22"/>
+                <w:lang w:val="en-US"/>
+              </w:rPr>
+              <w:t>applicant.passport_issuer</w:t>
+            </w:r>
+            <w:proofErr w:type="spellEnd"/>
+            <w:r>
+              <w:rPr>
+                <w:rFonts w:ascii="Cambria" w:hAnsi="Cambria" w:cs="Times New Roman;Times New Roman"/>
+                <w:sz w:val="22"/>
+                <w:szCs w:val="22"/>
+                <w:lang w:val="en-US"/>
+              </w:rPr>
+              <w:t xml:space="preserve"> }} {{ </w:t>
+            </w:r>
+            <w:proofErr w:type="spellStart"/>
+            <w:r>
+              <w:rPr>
+                <w:rFonts w:ascii="Cambria" w:hAnsi="Cambria" w:cs="Times New Roman;Times New Roman"/>
+                <w:sz w:val="22"/>
+                <w:szCs w:val="22"/>
+                <w:lang w:val="en-US"/>
+              </w:rPr>
+              <w:t>fmt_date_ru</w:t>
+            </w:r>
+            <w:proofErr w:type="spellEnd"/>
+            <w:r>
+              <w:rPr>
+                <w:rFonts w:ascii="Cambria" w:hAnsi="Cambria" w:cs="Times New Roman;Times New Roman"/>
+                <w:sz w:val="22"/>
+                <w:szCs w:val="22"/>
+                <w:lang w:val="en-US"/>
+              </w:rPr>
+              <w:t>(</w:t>
+            </w:r>
+            <w:proofErr w:type="spellStart"/>
+            <w:r>
+              <w:rPr>
+                <w:rFonts w:ascii="Cambria" w:hAnsi="Cambria" w:cs="Times New Roman;Times New Roman"/>
+                <w:sz w:val="22"/>
+                <w:szCs w:val="22"/>
+                <w:lang w:val="en-US"/>
+              </w:rPr>
+              <w:t>applicant.passport_issue_date</w:t>
+            </w:r>
+            <w:proofErr w:type="spellEnd"/>
+            <w:r>
+              <w:rPr>
+                <w:rFonts w:ascii="Cambria" w:hAnsi="Cambria" w:cs="Times New Roman;Times New Roman"/>
+                <w:sz w:val="22"/>
+                <w:szCs w:val="22"/>
+                <w:lang w:val="en-US"/>
+              </w:rPr>
+              <w:t>) }}</w:t>
+            </w:r>
+            <w:r>
+              <w:rPr>
+                <w:rFonts w:ascii="Cambria" w:hAnsi="Cambria" w:cs="Times New Roman;Times New Roman"/>
+                <w:sz w:val="22"/>
+                <w:szCs w:val="22"/>
+              </w:rPr>
+              <w:t>г</w:t>
+            </w:r>
+            <w:r>
+              <w:rPr>
+                <w:rFonts w:ascii="Cambria" w:hAnsi="Cambria" w:cs="Times New Roman;Times New Roman"/>
+                <w:sz w:val="22"/>
+                <w:szCs w:val="22"/>
+                <w:lang w:val="en-US"/>
+              </w:rPr>
+              <w:t>.,</w:t>
+            </w:r>
+          </w:p>
+          <w:p>
+            <w:pPr>
+              <w:pStyle w:val="ConsNormal"/>
+              <w:tabs>
+                <w:tab w:val="left" w:pos="1635"/>
+              </w:tabs>
+              <w:ind w:left="40"/>
+              <w:jc w:val="left"/>
+              <w:rPr>
+                <w:rFonts w:ascii="Cambria" w:hAnsi="Cambria"/>
+                <w:sz w:val="22"/>
+                <w:szCs w:val="22"/>
+                <w:lang w:val="en-US"/>
+              </w:rPr>
+            </w:pPr>
+            <w:r>
+              <w:rPr>
+                <w:rFonts w:ascii="Cambria" w:hAnsi="Cambria"/>
+                <w:sz w:val="22"/>
+                <w:szCs w:val="22"/>
+              </w:rPr>
+              <w:t>Счет</w:t>
+            </w:r>
+            <w:r>
+              <w:rPr>
+                <w:rFonts w:ascii="Cambria" w:hAnsi="Cambria"/>
+                <w:sz w:val="22"/>
+                <w:szCs w:val="22"/>
+                <w:lang w:val="en-US"/>
+              </w:rPr>
+              <w:t xml:space="preserve"> </w:t>
+            </w:r>
+            <w:proofErr w:type="gramStart"/>
+            <w:r>
+              <w:rPr>
+                <w:rFonts w:ascii="Cambria" w:hAnsi="Cambria"/>
+                <w:sz w:val="22"/>
+                <w:szCs w:val="22"/>
+                <w:lang w:val="en-US"/>
+              </w:rPr>
+              <w:t xml:space="preserve">{{ </w:t>
+            </w:r>
+            <w:proofErr w:type="spellStart"/>
+            <w:r>
+              <w:rPr>
+                <w:rFonts w:ascii="Cambria" w:hAnsi="Cambria"/>
+                <w:sz w:val="22"/>
+                <w:szCs w:val="22"/>
+                <w:lang w:val="en-US"/>
+              </w:rPr>
+              <w:t>applicant</w:t>
+            </w:r>
+            <w:proofErr w:type="gramEnd"/>
+            <w:r>
+              <w:rPr>
+                <w:rFonts w:ascii="Cambria" w:hAnsi="Cambria"/>
+                <w:sz w:val="22"/>
+                <w:szCs w:val="22"/>
+                <w:lang w:val="en-US"/>
+              </w:rPr>
+              <w:t>.bank_account</w:t>
+            </w:r>
+            <w:proofErr w:type="spellEnd"/>
+            <w:r>
+              <w:rPr>
+                <w:rFonts w:ascii="Cambria" w:hAnsi="Cambria"/>
+                <w:sz w:val="22"/>
+                <w:szCs w:val="22"/>
+                <w:lang w:val="en-US"/>
+              </w:rPr>
+              <w:t xml:space="preserve"> }}</w:t>
+            </w:r>
+          </w:p>
+          <w:p>
+            <w:pPr>
+              <w:pStyle w:val="ConsNormal"/>
+              <w:tabs>
+                <w:tab w:val="left" w:pos="1635"/>
+              </w:tabs>
+              <w:ind w:left="40"/>
+              <w:jc w:val="left"/>
+              <w:rPr>
+                <w:rFonts w:ascii="Cambria" w:hAnsi="Cambria"/>
+                <w:sz w:val="22"/>
+                <w:szCs w:val="22"/>
+                <w:lang w:val="en-US"/>
+              </w:rPr>
+            </w:pPr>
+            <w:proofErr w:type="gramStart"/>
+            <w:r>
+              <w:rPr>
+                <w:rFonts w:ascii="Cambria" w:hAnsi="Cambria"/>
+                <w:sz w:val="22"/>
+                <w:szCs w:val="22"/>
+                <w:lang w:val="en-US"/>
+              </w:rPr>
+              <w:t xml:space="preserve">{{ </w:t>
+            </w:r>
+            <w:proofErr w:type="spellStart"/>
+            <w:r>
+              <w:rPr>
+                <w:rFonts w:ascii="Cambria" w:hAnsi="Cambria"/>
+                <w:sz w:val="22"/>
+                <w:szCs w:val="22"/>
+                <w:lang w:val="en-US"/>
+              </w:rPr>
+              <w:t>applicant</w:t>
+            </w:r>
+            <w:proofErr w:type="gramEnd"/>
+            <w:r>
+              <w:rPr>
+                <w:rFonts w:ascii="Cambria" w:hAnsi="Cambria"/>
+                <w:sz w:val="22"/>
+                <w:szCs w:val="22"/>
+                <w:lang w:val="en-US"/>
+              </w:rPr>
+              <w:t>.bank_name</w:t>
+            </w:r>
+            <w:proofErr w:type="spellEnd"/>
+            <w:r>
+              <w:rPr>
+                <w:rFonts w:ascii="Cambria" w:hAnsi="Cambria"/>
+                <w:sz w:val="22"/>
+                <w:szCs w:val="22"/>
+                <w:lang w:val="en-US"/>
+              </w:rPr>
+              <w:t xml:space="preserve"> }}</w:t>
             </w:r>
           </w:p>
           <w:p>
@@ -1369,76 +3044,43 @@
                 <w:sz w:val="22"/>
                 <w:szCs w:val="22"/>
               </w:rPr>
-              <w:t>паспорт {{ applicant.passport_formatted }}, выдан {{ applicant.passport_issuer }} {{ fmt_date_ru(applicant.passport_issue_date) }}г.,</w:t>
+              <w:t xml:space="preserve">БИК </w:t>
             </w:r>
-          </w:p>
-          <w:p>
-            <w:pPr>
-              <w:pStyle w:val="ConsNormal"/>
-              <w:tabs>
-                <w:tab w:val="left" w:pos="1635"/>
-              </w:tabs>
-              <w:ind w:left="40"/>
-              <w:jc w:val="left"/>
-              <w:rPr>
-                <w:rFonts w:ascii="Cambria" w:hAnsi="Cambria"/>
-                <w:sz w:val="22"/>
-                <w:szCs w:val="22"/>
-              </w:rPr>
-            </w:pPr>
-            <w:r>
-              <w:rPr>
-                <w:rFonts w:ascii="Cambria" w:hAnsi="Cambria"/>
-                <w:sz w:val="22"/>
-                <w:szCs w:val="22"/>
-              </w:rPr>
-              <w:t>Счет {{ applicant.bank_account }}</w:t>
-            </w:r>
-          </w:p>
-          <w:p>
-            <w:pPr>
-              <w:pStyle w:val="ConsNormal"/>
-              <w:tabs>
-                <w:tab w:val="left" w:pos="1635"/>
-              </w:tabs>
-              <w:ind w:left="40"/>
-              <w:jc w:val="left"/>
-              <w:rPr>
-                <w:rFonts w:ascii="Cambria" w:hAnsi="Cambria"/>
-                <w:sz w:val="22"/>
-                <w:szCs w:val="22"/>
-              </w:rPr>
-            </w:pPr>
-            <w:r>
-              <w:rPr>
-                <w:rFonts w:ascii="Cambria" w:hAnsi="Cambria"/>
-                <w:sz w:val="22"/>
-                <w:szCs w:val="22"/>
-              </w:rPr>
-              <w:t>{{ applicant.bank_name }}</w:t>
-            </w:r>
-          </w:p>
-          <w:p>
-            <w:pPr>
-              <w:pStyle w:val="ConsNormal"/>
-              <w:tabs>
-                <w:tab w:val="left" w:pos="1635"/>
-              </w:tabs>
-              <w:ind w:left="40"/>
-              <w:jc w:val="left"/>
-              <w:rPr>
-                <w:rFonts w:ascii="Cambria" w:hAnsi="Cambria" w:cs="Times New Roman;Times New Roman"/>
-                <w:sz w:val="22"/>
-                <w:szCs w:val="22"/>
-              </w:rPr>
-            </w:pPr>
+            <w:proofErr w:type="gramStart"/>
             <w:r>
               <w:rPr>
                 <w:rFonts w:ascii="Cambria" w:hAnsi="Cambria" w:cs="Times New Roman;Times New Roman"/>
                 <w:sz w:val="22"/>
                 <w:szCs w:val="22"/>
               </w:rPr>
-              <w:t>БИК {{ applicant.bank_bic }}</w:t>
+              <w:t xml:space="preserve">{{ </w:t>
+            </w:r>
+            <w:proofErr w:type="spellStart"/>
+            <w:r>
+              <w:rPr>
+                <w:rFonts w:ascii="Cambria" w:hAnsi="Cambria" w:cs="Times New Roman;Times New Roman"/>
+                <w:sz w:val="22"/>
+                <w:szCs w:val="22"/>
+              </w:rPr>
+              <w:t>applicant</w:t>
+            </w:r>
+            <w:proofErr w:type="gramEnd"/>
+            <w:r>
+              <w:rPr>
+                <w:rFonts w:ascii="Cambria" w:hAnsi="Cambria" w:cs="Times New Roman;Times New Roman"/>
+                <w:sz w:val="22"/>
+                <w:szCs w:val="22"/>
+              </w:rPr>
+              <w:t>.bank_bic</w:t>
+            </w:r>
+            <w:proofErr w:type="spellEnd"/>
+            <w:r>
+              <w:rPr>
+                <w:rFonts w:ascii="Cambria" w:hAnsi="Cambria" w:cs="Times New Roman;Times New Roman"/>
+                <w:sz w:val="22"/>
+                <w:szCs w:val="22"/>
+              </w:rPr>
+              <w:t xml:space="preserve"> }}</w:t>
             </w:r>
           </w:p>
         </w:tc>
@@ -1671,7 +3313,7 @@
 </file>
 
 <file path=word/endnotes.xml><?xml version="1.0" encoding="utf-8"?>
-<w:endnotes xmlns:wpc="http://schemas.microsoft.com/office/word/2010/wordprocessingCanvas" xmlns:cx="http://schemas.microsoft.com/office/drawing/2014/chartex" xmlns:cx1="http://schemas.microsoft.com/office/drawing/2015/9/8/chartex" xmlns:cx2="http://schemas.microsoft.com/office/drawing/2015/10/21/chartex" xmlns:cx3="http://schemas.microsoft.com/office/drawing/2016/5/9/chartex" xmlns:cx4="http://schemas.microsoft.com/office/drawing/2016/5/10/chartex" xmlns:cx5="http://schemas.microsoft.com/office/drawing/2016/5/11/chartex" xmlns:cx6="http://schemas.microsoft.com/office/drawing/2016/5/12/chartex" xmlns:cx7="http://schemas.microsoft.com/office/drawing/2016/5/13/chartex" xmlns:cx8="http://schemas.microsoft.com/office/drawing/2016/5/14/chartex" xmlns:mc="http://schemas.openxmlformats.org/markup-compatibility/2006" xmlns:aink="http://schemas.microsoft.com/office/drawing/2016/ink" xmlns:am3d="http://schemas.microsoft.com/office/drawing/2017/model3d" xmlns:o="urn:schemas-microsoft-com:office:office" xmlns:oel="http://schemas.microsoft.com/office/2019/extlst" xmlns:r="http://schemas.openxmlformats.org/officeDocument/2006/relationships" xmlns:m="http://schemas.openxmlformats.org/officeDocument/2006/math" xmlns:v="urn:schemas-microsoft-com:vml" xmlns:wp14="http://schemas.microsoft.com/office/word/2010/wordprocessingDrawing" xmlns:wp="http://schemas.openxmlformats.org/drawingml/2006/wordprocessingDrawing" xmlns:w10="urn:schemas-microsoft-com:office:word" xmlns:w="http://schemas.openxmlformats.org/wordprocessingml/2006/main" xmlns:w14="http://schemas.microsoft.com/office/word/2010/wordml" xmlns:w15="http://schemas.microsoft.com/office/word/2012/wordml" xmlns:w16cex="http://schemas.microsoft.com/office/word/2018/wordml/cex" xmlns:w16cid="http://schemas.microsoft.com/office/word/2016/wordml/cid" xmlns:w16="http://schemas.microsoft.com/office/word/2018/wordml" xmlns:w16du="http://schemas.microsoft.com/office/word/2023/wordml/word16du" xmlns:w16sdtdh="http://schemas.microsoft.com/office/word/2020/wordml/sdtdatahash" xmlns:w16sdtfl="http://schemas.microsoft.com/office/word/2024/wordml/sdtformatlock" xmlns:w16se="http://schemas.microsoft.com/office/word/2015/wordml/symex" xmlns:wpg="http://schemas.microsoft.com/office/word/2010/wordprocessingGroup" xmlns:wpi="http://schemas.microsoft.com/office/word/2010/wordprocessingInk" xmlns:wne="http://schemas.microsoft.com/office/word/2006/wordml" xmlns:wps="http://schemas.microsoft.com/office/word/2010/wordprocessingShape" mc:Ignorable="w14 w15 w16se w16cid w16 w16cex w16sdtdh w16sdtfl w16du wp14">
+<w:endnotes xmlns:wpc="http://schemas.microsoft.com/office/word/2010/wordprocessingCanvas" xmlns:cx="http://schemas.microsoft.com/office/drawing/2014/chartex" xmlns:cx1="http://schemas.microsoft.com/office/drawing/2015/9/8/chartex" xmlns:cx2="http://schemas.microsoft.com/office/drawing/2015/10/21/chartex" xmlns:cx3="http://schemas.microsoft.com/office/drawing/2016/5/9/chartex" xmlns:cx4="http://schemas.microsoft.com/office/drawing/2016/5/10/chartex" xmlns:cx5="http://schemas.microsoft.com/office/drawing/2016/5/11/chartex" xmlns:cx6="http://schemas.microsoft.com/office/drawing/2016/5/12/chartex" xmlns:cx7="http://schemas.microsoft.com/office/drawing/2016/5/13/chartex" xmlns:cx8="http://schemas.microsoft.com/office/drawing/2016/5/14/chartex" xmlns:mc="http://schemas.openxmlformats.org/markup-compatibility/2006" xmlns:aink="http://schemas.microsoft.com/office/drawing/2016/ink" xmlns:am3d="http://schemas.microsoft.com/office/drawing/2017/model3d" xmlns:o="urn:schemas-microsoft-com:office:office" xmlns:r="http://schemas.openxmlformats.org/officeDocument/2006/relationships" xmlns:m="http://schemas.openxmlformats.org/officeDocument/2006/math" xmlns:v="urn:schemas-microsoft-com:vml" xmlns:wp14="http://schemas.microsoft.com/office/word/2010/wordprocessingDrawing" xmlns:wp="http://schemas.openxmlformats.org/drawingml/2006/wordprocessingDrawing" xmlns:w10="urn:schemas-microsoft-com:office:word" xmlns:w="http://schemas.openxmlformats.org/wordprocessingml/2006/main" xmlns:w14="http://schemas.microsoft.com/office/word/2010/wordml" xmlns:w15="http://schemas.microsoft.com/office/word/2012/wordml" xmlns:w16cid="http://schemas.microsoft.com/office/word/2016/wordml/cid" xmlns:w16se="http://schemas.microsoft.com/office/word/2015/wordml/symex" xmlns:wpg="http://schemas.microsoft.com/office/word/2010/wordprocessingGroup" xmlns:wpi="http://schemas.microsoft.com/office/word/2010/wordprocessingInk" xmlns:wne="http://schemas.microsoft.com/office/word/2006/wordml" xmlns:wps="http://schemas.microsoft.com/office/word/2010/wordprocessingShape" mc:Ignorable="w14 w15 w16se w16cid wp14">
   <w:endnote w:type="separator" w:id="-1">
     <w:p>
       <w:pPr>
@@ -1696,7 +3338,7 @@
 </file>
 
 <file path=word/footer1.xml><?xml version="1.0" encoding="utf-8"?>
-<w:ftr xmlns:wpc="http://schemas.microsoft.com/office/word/2010/wordprocessingCanvas" xmlns:cx="http://schemas.microsoft.com/office/drawing/2014/chartex" xmlns:cx1="http://schemas.microsoft.com/office/drawing/2015/9/8/chartex" xmlns:cx2="http://schemas.microsoft.com/office/drawing/2015/10/21/chartex" xmlns:cx3="http://schemas.microsoft.com/office/drawing/2016/5/9/chartex" xmlns:cx4="http://schemas.microsoft.com/office/drawing/2016/5/10/chartex" xmlns:cx5="http://schemas.microsoft.com/office/drawing/2016/5/11/chartex" xmlns:cx6="http://schemas.microsoft.com/office/drawing/2016/5/12/chartex" xmlns:cx7="http://schemas.microsoft.com/office/drawing/2016/5/13/chartex" xmlns:cx8="http://schemas.microsoft.com/office/drawing/2016/5/14/chartex" xmlns:mc="http://schemas.openxmlformats.org/markup-compatibility/2006" xmlns:aink="http://schemas.microsoft.com/office/drawing/2016/ink" xmlns:am3d="http://schemas.microsoft.com/office/drawing/2017/model3d" xmlns:o="urn:schemas-microsoft-com:office:office" xmlns:oel="http://schemas.microsoft.com/office/2019/extlst" xmlns:r="http://schemas.openxmlformats.org/officeDocument/2006/relationships" xmlns:m="http://schemas.openxmlformats.org/officeDocument/2006/math" xmlns:v="urn:schemas-microsoft-com:vml" xmlns:wp14="http://schemas.microsoft.com/office/word/2010/wordprocessingDrawing" xmlns:wp="http://schemas.openxmlformats.org/drawingml/2006/wordprocessingDrawing" xmlns:w10="urn:schemas-microsoft-com:office:word" xmlns:w="http://schemas.openxmlformats.org/wordprocessingml/2006/main" xmlns:w14="http://schemas.microsoft.com/office/word/2010/wordml" xmlns:w15="http://schemas.microsoft.com/office/word/2012/wordml" xmlns:w16cex="http://schemas.microsoft.com/office/word/2018/wordml/cex" xmlns:w16cid="http://schemas.microsoft.com/office/word/2016/wordml/cid" xmlns:w16="http://schemas.microsoft.com/office/word/2018/wordml" xmlns:w16du="http://schemas.microsoft.com/office/word/2023/wordml/word16du" xmlns:w16sdtdh="http://schemas.microsoft.com/office/word/2020/wordml/sdtdatahash" xmlns:w16sdtfl="http://schemas.microsoft.com/office/word/2024/wordml/sdtformatlock" xmlns:w16se="http://schemas.microsoft.com/office/word/2015/wordml/symex" xmlns:wpg="http://schemas.microsoft.com/office/word/2010/wordprocessingGroup" xmlns:wpi="http://schemas.microsoft.com/office/word/2010/wordprocessingInk" xmlns:wne="http://schemas.microsoft.com/office/word/2006/wordml" xmlns:wps="http://schemas.microsoft.com/office/word/2010/wordprocessingShape" mc:Ignorable="w14 w15 w16se w16cid w16 w16cex w16sdtdh w16sdtfl w16du wp14">
+<w:ftr xmlns:wpc="http://schemas.microsoft.com/office/word/2010/wordprocessingCanvas" xmlns:cx="http://schemas.microsoft.com/office/drawing/2014/chartex" xmlns:cx1="http://schemas.microsoft.com/office/drawing/2015/9/8/chartex" xmlns:cx2="http://schemas.microsoft.com/office/drawing/2015/10/21/chartex" xmlns:cx3="http://schemas.microsoft.com/office/drawing/2016/5/9/chartex" xmlns:cx4="http://schemas.microsoft.com/office/drawing/2016/5/10/chartex" xmlns:cx5="http://schemas.microsoft.com/office/drawing/2016/5/11/chartex" xmlns:cx6="http://schemas.microsoft.com/office/drawing/2016/5/12/chartex" xmlns:cx7="http://schemas.microsoft.com/office/drawing/2016/5/13/chartex" xmlns:cx8="http://schemas.microsoft.com/office/drawing/2016/5/14/chartex" xmlns:mc="http://schemas.openxmlformats.org/markup-compatibility/2006" xmlns:aink="http://schemas.microsoft.com/office/drawing/2016/ink" xmlns:am3d="http://schemas.microsoft.com/office/drawing/2017/model3d" xmlns:o="urn:schemas-microsoft-com:office:office" xmlns:r="http://schemas.openxmlformats.org/officeDocument/2006/relationships" xmlns:m="http://schemas.openxmlformats.org/officeDocument/2006/math" xmlns:v="urn:schemas-microsoft-com:vml" xmlns:wp14="http://schemas.microsoft.com/office/word/2010/wordprocessingDrawing" xmlns:wp="http://schemas.openxmlformats.org/drawingml/2006/wordprocessingDrawing" xmlns:w10="urn:schemas-microsoft-com:office:word" xmlns:w="http://schemas.openxmlformats.org/wordprocessingml/2006/main" xmlns:w14="http://schemas.microsoft.com/office/word/2010/wordml" xmlns:w15="http://schemas.microsoft.com/office/word/2012/wordml" xmlns:w16cid="http://schemas.microsoft.com/office/word/2016/wordml/cid" xmlns:w16se="http://schemas.microsoft.com/office/word/2015/wordml/symex" xmlns:wpg="http://schemas.microsoft.com/office/word/2010/wordprocessingGroup" xmlns:wpi="http://schemas.microsoft.com/office/word/2010/wordprocessingInk" xmlns:wne="http://schemas.microsoft.com/office/word/2006/wordml" xmlns:wps="http://schemas.microsoft.com/office/word/2010/wordprocessingShape" mc:Ignorable="w14 w15 w16se w16cid wp14">
   <w:sdt>
     <w:sdtPr>
       <w:id w:val="1992599383"/>
@@ -1705,6 +3347,7 @@
         <w:docPartUnique/>
       </w:docPartObj>
     </w:sdtPr>
+    <w:sdtEndPr/>
     <w:sdtContent>
       <w:p>
         <w:pPr>
@@ -1740,7 +3383,7 @@
 </file>
 
 <file path=word/footnotes.xml><?xml version="1.0" encoding="utf-8"?>
-<w:footnotes xmlns:wpc="http://schemas.microsoft.com/office/word/2010/wordprocessingCanvas" xmlns:cx="http://schemas.microsoft.com/office/drawing/2014/chartex" xmlns:cx1="http://schemas.microsoft.com/office/drawing/2015/9/8/chartex" xmlns:cx2="http://schemas.microsoft.com/office/drawing/2015/10/21/chartex" xmlns:cx3="http://schemas.microsoft.com/office/drawing/2016/5/9/chartex" xmlns:cx4="http://schemas.microsoft.com/office/drawing/2016/5/10/chartex" xmlns:cx5="http://schemas.microsoft.com/office/drawing/2016/5/11/chartex" xmlns:cx6="http://schemas.microsoft.com/office/drawing/2016/5/12/chartex" xmlns:cx7="http://schemas.microsoft.com/office/drawing/2016/5/13/chartex" xmlns:cx8="http://schemas.microsoft.com/office/drawing/2016/5/14/chartex" xmlns:mc="http://schemas.openxmlformats.org/markup-compatibility/2006" xmlns:aink="http://schemas.microsoft.com/office/drawing/2016/ink" xmlns:am3d="http://schemas.microsoft.com/office/drawing/2017/model3d" xmlns:o="urn:schemas-microsoft-com:office:office" xmlns:oel="http://schemas.microsoft.com/office/2019/extlst" xmlns:r="http://schemas.openxmlformats.org/officeDocument/2006/relationships" xmlns:m="http://schemas.openxmlformats.org/officeDocument/2006/math" xmlns:v="urn:schemas-microsoft-com:vml" xmlns:wp14="http://schemas.microsoft.com/office/word/2010/wordprocessingDrawing" xmlns:wp="http://schemas.openxmlformats.org/drawingml/2006/wordprocessingDrawing" xmlns:w10="urn:schemas-microsoft-com:office:word" xmlns:w="http://schemas.openxmlformats.org/wordprocessingml/2006/main" xmlns:w14="http://schemas.microsoft.com/office/word/2010/wordml" xmlns:w15="http://schemas.microsoft.com/office/word/2012/wordml" xmlns:w16cex="http://schemas.microsoft.com/office/word/2018/wordml/cex" xmlns:w16cid="http://schemas.microsoft.com/office/word/2016/wordml/cid" xmlns:w16="http://schemas.microsoft.com/office/word/2018/wordml" xmlns:w16du="http://schemas.microsoft.com/office/word/2023/wordml/word16du" xmlns:w16sdtdh="http://schemas.microsoft.com/office/word/2020/wordml/sdtdatahash" xmlns:w16sdtfl="http://schemas.microsoft.com/office/word/2024/wordml/sdtformatlock" xmlns:w16se="http://schemas.microsoft.com/office/word/2015/wordml/symex" xmlns:wpg="http://schemas.microsoft.com/office/word/2010/wordprocessingGroup" xmlns:wpi="http://schemas.microsoft.com/office/word/2010/wordprocessingInk" xmlns:wne="http://schemas.microsoft.com/office/word/2006/wordml" xmlns:wps="http://schemas.microsoft.com/office/word/2010/wordprocessingShape" mc:Ignorable="w14 w15 w16se w16cid w16 w16cex w16sdtdh w16sdtfl w16du wp14">
+<w:footnotes xmlns:wpc="http://schemas.microsoft.com/office/word/2010/wordprocessingCanvas" xmlns:cx="http://schemas.microsoft.com/office/drawing/2014/chartex" xmlns:cx1="http://schemas.microsoft.com/office/drawing/2015/9/8/chartex" xmlns:cx2="http://schemas.microsoft.com/office/drawing/2015/10/21/chartex" xmlns:cx3="http://schemas.microsoft.com/office/drawing/2016/5/9/chartex" xmlns:cx4="http://schemas.microsoft.com/office/drawing/2016/5/10/chartex" xmlns:cx5="http://schemas.microsoft.com/office/drawing/2016/5/11/chartex" xmlns:cx6="http://schemas.microsoft.com/office/drawing/2016/5/12/chartex" xmlns:cx7="http://schemas.microsoft.com/office/drawing/2016/5/13/chartex" xmlns:cx8="http://schemas.microsoft.com/office/drawing/2016/5/14/chartex" xmlns:mc="http://schemas.openxmlformats.org/markup-compatibility/2006" xmlns:aink="http://schemas.microsoft.com/office/drawing/2016/ink" xmlns:am3d="http://schemas.microsoft.com/office/drawing/2017/model3d" xmlns:o="urn:schemas-microsoft-com:office:office" xmlns:r="http://schemas.openxmlformats.org/officeDocument/2006/relationships" xmlns:m="http://schemas.openxmlformats.org/officeDocument/2006/math" xmlns:v="urn:schemas-microsoft-com:vml" xmlns:wp14="http://schemas.microsoft.com/office/word/2010/wordprocessingDrawing" xmlns:wp="http://schemas.openxmlformats.org/drawingml/2006/wordprocessingDrawing" xmlns:w10="urn:schemas-microsoft-com:office:word" xmlns:w="http://schemas.openxmlformats.org/wordprocessingml/2006/main" xmlns:w14="http://schemas.microsoft.com/office/word/2010/wordml" xmlns:w15="http://schemas.microsoft.com/office/word/2012/wordml" xmlns:w16cid="http://schemas.microsoft.com/office/word/2016/wordml/cid" xmlns:w16se="http://schemas.microsoft.com/office/word/2015/wordml/symex" xmlns:wpg="http://schemas.microsoft.com/office/word/2010/wordprocessingGroup" xmlns:wpi="http://schemas.microsoft.com/office/word/2010/wordprocessingInk" xmlns:wne="http://schemas.microsoft.com/office/word/2006/wordml" xmlns:wps="http://schemas.microsoft.com/office/word/2010/wordprocessingShape" mc:Ignorable="w14 w15 w16se w16cid wp14">
   <w:footnote w:type="separator" w:id="-1">
     <w:p>
       <w:pPr>
@@ -1765,7 +3408,7 @@
 </file>
 
 <file path=word/numbering.xml><?xml version="1.0" encoding="utf-8"?>
-<w:numbering xmlns:wpc="http://schemas.microsoft.com/office/word/2010/wordprocessingCanvas" xmlns:cx="http://schemas.microsoft.com/office/drawing/2014/chartex" xmlns:cx1="http://schemas.microsoft.com/office/drawing/2015/9/8/chartex" xmlns:cx2="http://schemas.microsoft.com/office/drawing/2015/10/21/chartex" xmlns:cx3="http://schemas.microsoft.com/office/drawing/2016/5/9/chartex" xmlns:cx4="http://schemas.microsoft.com/office/drawing/2016/5/10/chartex" xmlns:cx5="http://schemas.microsoft.com/office/drawing/2016/5/11/chartex" xmlns:cx6="http://schemas.microsoft.com/office/drawing/2016/5/12/chartex" xmlns:cx7="http://schemas.microsoft.com/office/drawing/2016/5/13/chartex" xmlns:cx8="http://schemas.microsoft.com/office/drawing/2016/5/14/chartex" xmlns:mc="http://schemas.openxmlformats.org/markup-compatibility/2006" xmlns:aink="http://schemas.microsoft.com/office/drawing/2016/ink" xmlns:am3d="http://schemas.microsoft.com/office/drawing/2017/model3d" xmlns:o="urn:schemas-microsoft-com:office:office" xmlns:oel="http://schemas.microsoft.com/office/2019/extlst" xmlns:r="http://schemas.openxmlformats.org/officeDocument/2006/relationships" xmlns:m="http://schemas.openxmlformats.org/officeDocument/2006/math" xmlns:v="urn:schemas-microsoft-com:vml" xmlns:wp14="http://schemas.microsoft.com/office/word/2010/wordprocessingDrawing" xmlns:wp="http://schemas.openxmlformats.org/drawingml/2006/wordprocessingDrawing" xmlns:w10="urn:schemas-microsoft-com:office:word" xmlns:w="http://schemas.openxmlformats.org/wordprocessingml/2006/main" xmlns:w14="http://schemas.microsoft.com/office/word/2010/wordml" xmlns:w15="http://schemas.microsoft.com/office/word/2012/wordml" xmlns:w16cex="http://schemas.microsoft.com/office/word/2018/wordml/cex" xmlns:w16cid="http://schemas.microsoft.com/office/word/2016/wordml/cid" xmlns:w16="http://schemas.microsoft.com/office/word/2018/wordml" xmlns:w16du="http://schemas.microsoft.com/office/word/2023/wordml/word16du" xmlns:w16sdtdh="http://schemas.microsoft.com/office/word/2020/wordml/sdtdatahash" xmlns:w16sdtfl="http://schemas.microsoft.com/office/word/2024/wordml/sdtformatlock" xmlns:w16se="http://schemas.microsoft.com/office/word/2015/wordml/symex" xmlns:wpg="http://schemas.microsoft.com/office/word/2010/wordprocessingGroup" xmlns:wpi="http://schemas.microsoft.com/office/word/2010/wordprocessingInk" xmlns:wne="http://schemas.microsoft.com/office/word/2006/wordml" xmlns:wps="http://schemas.microsoft.com/office/word/2010/wordprocessingShape" mc:Ignorable="w14 w15 w16se w16cid w16 w16cex w16sdtdh w16sdtfl w16du wp14">
+<w:numbering xmlns:wpc="http://schemas.microsoft.com/office/word/2010/wordprocessingCanvas" xmlns:cx="http://schemas.microsoft.com/office/drawing/2014/chartex" xmlns:cx1="http://schemas.microsoft.com/office/drawing/2015/9/8/chartex" xmlns:cx2="http://schemas.microsoft.com/office/drawing/2015/10/21/chartex" xmlns:cx3="http://schemas.microsoft.com/office/drawing/2016/5/9/chartex" xmlns:cx4="http://schemas.microsoft.com/office/drawing/2016/5/10/chartex" xmlns:cx5="http://schemas.microsoft.com/office/drawing/2016/5/11/chartex" xmlns:cx6="http://schemas.microsoft.com/office/drawing/2016/5/12/chartex" xmlns:cx7="http://schemas.microsoft.com/office/drawing/2016/5/13/chartex" xmlns:cx8="http://schemas.microsoft.com/office/drawing/2016/5/14/chartex" xmlns:mc="http://schemas.openxmlformats.org/markup-compatibility/2006" xmlns:aink="http://schemas.microsoft.com/office/drawing/2016/ink" xmlns:am3d="http://schemas.microsoft.com/office/drawing/2017/model3d" xmlns:o="urn:schemas-microsoft-com:office:office" xmlns:r="http://schemas.openxmlformats.org/officeDocument/2006/relationships" xmlns:m="http://schemas.openxmlformats.org/officeDocument/2006/math" xmlns:v="urn:schemas-microsoft-com:vml" xmlns:wp14="http://schemas.microsoft.com/office/word/2010/wordprocessingDrawing" xmlns:wp="http://schemas.openxmlformats.org/drawingml/2006/wordprocessingDrawing" xmlns:w10="urn:schemas-microsoft-com:office:word" xmlns:w="http://schemas.openxmlformats.org/wordprocessingml/2006/main" xmlns:w14="http://schemas.microsoft.com/office/word/2010/wordml" xmlns:w15="http://schemas.microsoft.com/office/word/2012/wordml" xmlns:w16cid="http://schemas.microsoft.com/office/word/2016/wordml/cid" xmlns:w16se="http://schemas.microsoft.com/office/word/2015/wordml/symex" xmlns:wpg="http://schemas.microsoft.com/office/word/2010/wordprocessingGroup" xmlns:wpi="http://schemas.microsoft.com/office/word/2010/wordprocessingInk" xmlns:wne="http://schemas.microsoft.com/office/word/2006/wordml" xmlns:wps="http://schemas.microsoft.com/office/word/2010/wordprocessingShape" mc:Ignorable="w14 w15 w16se w16cid wp14">
   <w:abstractNum w:abstractNumId="0" w15:restartNumberingAfterBreak="0">
     <w:nsid w:val="270F31C1"/>
     <w:multiLevelType w:val="multilevel"/>
@@ -1992,17 +3635,17 @@
       </w:rPr>
     </w:lvl>
   </w:abstractNum>
-  <w:num w:numId="1" w16cid:durableId="54591724">
+  <w:num w:numId="1">
     <w:abstractNumId w:val="1"/>
   </w:num>
-  <w:num w:numId="2" w16cid:durableId="639502230">
+  <w:num w:numId="2">
     <w:abstractNumId w:val="0"/>
   </w:num>
 </w:numbering>
 </file>
 
 <file path=word/styles.xml><?xml version="1.0" encoding="utf-8"?>
-<w:styles xmlns:mc="http://schemas.openxmlformats.org/markup-compatibility/2006" xmlns:r="http://schemas.openxmlformats.org/officeDocument/2006/relationships" xmlns:w="http://schemas.openxmlformats.org/wordprocessingml/2006/main" xmlns:w14="http://schemas.microsoft.com/office/word/2010/wordml" xmlns:w15="http://schemas.microsoft.com/office/word/2012/wordml" xmlns:w16cex="http://schemas.microsoft.com/office/word/2018/wordml/cex" xmlns:w16cid="http://schemas.microsoft.com/office/word/2016/wordml/cid" xmlns:w16="http://schemas.microsoft.com/office/word/2018/wordml" xmlns:w16du="http://schemas.microsoft.com/office/word/2023/wordml/word16du" xmlns:w16sdtdh="http://schemas.microsoft.com/office/word/2020/wordml/sdtdatahash" xmlns:w16sdtfl="http://schemas.microsoft.com/office/word/2024/wordml/sdtformatlock" xmlns:w16se="http://schemas.microsoft.com/office/word/2015/wordml/symex" mc:Ignorable="w14 w15 w16se w16cid w16 w16cex w16sdtdh w16sdtfl w16du">
+<w:styles xmlns:mc="http://schemas.openxmlformats.org/markup-compatibility/2006" xmlns:r="http://schemas.openxmlformats.org/officeDocument/2006/relationships" xmlns:w="http://schemas.openxmlformats.org/wordprocessingml/2006/main" xmlns:w14="http://schemas.microsoft.com/office/word/2010/wordml" xmlns:w15="http://schemas.microsoft.com/office/word/2012/wordml" xmlns:w16cid="http://schemas.microsoft.com/office/word/2016/wordml/cid" xmlns:w16se="http://schemas.microsoft.com/office/word/2015/wordml/symex" mc:Ignorable="w14 w15 w16se w16cid">
   <w:docDefaults>
     <w:rPrDefault>
       <w:rPr>
@@ -2014,7 +3657,7 @@
     </w:rPrDefault>
     <w:pPrDefault/>
   </w:docDefaults>
-  <w:latentStyles w:defLockedState="0" w:defUIPriority="99" w:defSemiHidden="0" w:defUnhideWhenUsed="0" w:defQFormat="0" w:count="376">
+  <w:latentStyles w:defLockedState="0" w:defUIPriority="99" w:defSemiHidden="0" w:defUnhideWhenUsed="0" w:defQFormat="0" w:count="375">
     <w:lsdException w:name="Normal" w:uiPriority="0" w:qFormat="1"/>
     <w:lsdException w:name="heading 1" w:uiPriority="9" w:qFormat="1"/>
     <w:lsdException w:name="heading 2" w:semiHidden="1" w:uiPriority="9" w:unhideWhenUsed="1" w:qFormat="1"/>
@@ -2390,7 +4033,6 @@
     <w:lsdException w:name="Smart Hyperlink" w:semiHidden="1" w:unhideWhenUsed="1"/>
     <w:lsdException w:name="Hashtag" w:semiHidden="1" w:unhideWhenUsed="1"/>
     <w:lsdException w:name="Unresolved Mention" w:semiHidden="1" w:unhideWhenUsed="1"/>
-    <w:lsdException w:name="Smart Link" w:semiHidden="1" w:unhideWhenUsed="1"/>
   </w:latentStyles>
   <w:style w:type="paragraph" w:default="1" w:styleId="a">
     <w:name w:val="Normal"/>

</xml_diff>